<commit_message>
Software Requirements Ver 1.1
</commit_message>
<xml_diff>
--- a/doc/Calculatorz_Software_Requirements_Specifications.docx
+++ b/doc/Calculatorz_Software_Requirements_Specifications.docx
@@ -77,7 +77,7 @@
           <w:szCs w:val="28"/>
           <w:rtl w:val="0"/>
         </w:rPr>
-        <w:t xml:space="preserve">Version 1.0</w:t>
+        <w:t xml:space="preserve">Version 1.1</w:t>
       </w:r>
     </w:p>
     <w:p>
@@ -190,6 +190,13 @@
           <w:shd w:fill="auto" w:val="clear"/>
           <w:vertAlign w:val="baseline"/>
         </w:rPr>
+        <w:sectPr>
+          <w:headerReference r:id="rId7" w:type="default"/>
+          <w:footerReference r:id="rId8" w:type="even"/>
+          <w:pgSz w:h="15840" w:w="12240" w:orient="portrait"/>
+          <w:pgMar w:bottom="1440" w:top="1440" w:left="1440" w:right="1440" w:header="720" w:footer="720"/>
+          <w:pgNumType w:start="1"/>
+        </w:sectPr>
       </w:pPr>
       <w:r>
         <w:rPr>
@@ -209,52 +216,6 @@
           <w:rtl w:val="0"/>
         </w:rPr>
         <w:t xml:space="preserve">[To customize automatic fields in Microsoft Word (which display a gray background when selected), select File&gt;Properties and replace the Title, Subject and Company fields with the appropriate information for this document. After closing the dialog, automatic fields may be updated throughout the document by selecting Edit&gt;Select All (or Ctrl-A) and pressing F9, or simply click on the field and press F9.  This must be done separately for Headers and Footers.  Alt-F9 will toggle between displaying the field names and the field contents.  See Word help for more information on working with fields.] </w:t>
-      </w:r>
-    </w:p>
-    <w:p>
-      <w:pPr>
-        <w:keepNext w:val="0"/>
-        <w:keepLines w:val="1"/>
-        <w:pageBreakBefore w:val="0"/>
-        <w:widowControl w:val="0"/>
-        <w:pBdr>
-          <w:top w:space="0" w:sz="0" w:val="nil"/>
-          <w:left w:space="0" w:sz="0" w:val="nil"/>
-          <w:bottom w:space="0" w:sz="0" w:val="nil"/>
-          <w:right w:space="0" w:sz="0" w:val="nil"/>
-          <w:between w:space="0" w:sz="0" w:val="nil"/>
-        </w:pBdr>
-        <w:shd w:fill="auto" w:val="clear"/>
-        <w:spacing w:after="120" w:before="0" w:line="240" w:lineRule="auto"/>
-        <w:ind w:left="720" w:right="0" w:firstLine="0"/>
-        <w:jc w:val="left"/>
-        <w:rPr>
-          <w:rFonts w:ascii="Times New Roman" w:cs="Times New Roman" w:eastAsia="Times New Roman" w:hAnsi="Times New Roman"/>
-          <w:b w:val="0"/>
-          <w:bCs w:val="0"/>
-          <w:i w:val="0"/>
-          <w:iCs w:val="0"/>
-          <w:smallCaps w:val="0"/>
-          <w:strike w:val="0"/>
-          <w:color w:val="000000"/>
-          <w:sz w:val="20"/>
-          <w:szCs w:val="20"/>
-          <w:u w:val="none"/>
-          <w:shd w:fill="auto" w:val="clear"/>
-          <w:vertAlign w:val="baseline"/>
-        </w:rPr>
-        <w:sectPr>
-          <w:headerReference r:id="rId7" w:type="default"/>
-          <w:footerReference r:id="rId8" w:type="even"/>
-          <w:pgSz w:h="15840" w:w="12240" w:orient="portrait"/>
-          <w:pgMar w:bottom="1440" w:top="1440" w:left="1440" w:right="1440" w:header="720" w:footer="720"/>
-          <w:pgNumType w:start="1"/>
-        </w:sectPr>
-      </w:pPr>
-      <w:r>
-        <w:rPr>
-          <w:rtl w:val="0"/>
-        </w:rPr>
       </w:r>
     </w:p>
     <w:p>
@@ -315,7 +276,6 @@
             <w:pPr>
               <w:keepNext w:val="0"/>
               <w:keepLines w:val="1"/>
-              <w:pageBreakBefore w:val="0"/>
               <w:widowControl w:val="0"/>
               <w:pBdr>
                 <w:top w:space="0" w:sz="0" w:val="nil"/>
@@ -373,7 +333,6 @@
             <w:pPr>
               <w:keepNext w:val="0"/>
               <w:keepLines w:val="1"/>
-              <w:pageBreakBefore w:val="0"/>
               <w:widowControl w:val="0"/>
               <w:pBdr>
                 <w:top w:space="0" w:sz="0" w:val="nil"/>
@@ -431,7 +390,6 @@
             <w:pPr>
               <w:keepNext w:val="0"/>
               <w:keepLines w:val="1"/>
-              <w:pageBreakBefore w:val="0"/>
               <w:widowControl w:val="0"/>
               <w:pBdr>
                 <w:top w:space="0" w:sz="0" w:val="nil"/>
@@ -489,7 +447,6 @@
             <w:pPr>
               <w:keepNext w:val="0"/>
               <w:keepLines w:val="1"/>
-              <w:pageBreakBefore w:val="0"/>
               <w:widowControl w:val="0"/>
               <w:pBdr>
                 <w:top w:space="0" w:sz="0" w:val="nil"/>
@@ -554,7 +511,6 @@
             <w:pPr>
               <w:keepNext w:val="0"/>
               <w:keepLines w:val="1"/>
-              <w:pageBreakBefore w:val="0"/>
               <w:widowControl w:val="0"/>
               <w:pBdr>
                 <w:top w:space="0" w:sz="0" w:val="nil"/>
@@ -604,7 +560,6 @@
             <w:pPr>
               <w:keepNext w:val="0"/>
               <w:keepLines w:val="1"/>
-              <w:pageBreakBefore w:val="0"/>
               <w:widowControl w:val="0"/>
               <w:pBdr>
                 <w:top w:space="0" w:sz="0" w:val="nil"/>
@@ -654,7 +609,6 @@
             <w:pPr>
               <w:keepNext w:val="0"/>
               <w:keepLines w:val="1"/>
-              <w:pageBreakBefore w:val="0"/>
               <w:widowControl w:val="0"/>
               <w:pBdr>
                 <w:top w:space="0" w:sz="0" w:val="nil"/>
@@ -704,7 +658,6 @@
             <w:pPr>
               <w:keepNext w:val="0"/>
               <w:keepLines w:val="1"/>
-              <w:pageBreakBefore w:val="0"/>
               <w:widowControl w:val="0"/>
               <w:pBdr>
                 <w:top w:space="0" w:sz="0" w:val="nil"/>
@@ -761,7 +714,104 @@
             <w:pPr>
               <w:keepNext w:val="0"/>
               <w:keepLines w:val="1"/>
-              <w:pageBreakBefore w:val="0"/>
+              <w:widowControl w:val="0"/>
+              <w:pBdr>
+                <w:top w:space="0" w:sz="0" w:val="nil"/>
+                <w:left w:space="0" w:sz="0" w:val="nil"/>
+                <w:bottom w:space="0" w:sz="0" w:val="nil"/>
+                <w:right w:space="0" w:sz="0" w:val="nil"/>
+                <w:between w:space="0" w:sz="0" w:val="nil"/>
+              </w:pBdr>
+              <w:shd w:fill="auto" w:val="clear"/>
+              <w:spacing w:after="0" w:before="0" w:line="240" w:lineRule="auto"/>
+              <w:ind w:left="0" w:right="0" w:firstLine="0"/>
+              <w:jc w:val="left"/>
+              <w:rPr>
+                <w:rFonts w:ascii="Times New Roman" w:cs="Times New Roman" w:eastAsia="Times New Roman" w:hAnsi="Times New Roman"/>
+                <w:b w:val="0"/>
+                <w:bCs w:val="0"/>
+                <w:i w:val="0"/>
+                <w:iCs w:val="0"/>
+                <w:smallCaps w:val="0"/>
+                <w:strike w:val="0"/>
+                <w:color w:val="000000"/>
+                <w:sz w:val="20"/>
+                <w:szCs w:val="20"/>
+                <w:u w:val="none"/>
+                <w:shd w:fill="auto" w:val="clear"/>
+                <w:vertAlign w:val="baseline"/>
+              </w:rPr>
+            </w:pPr>
+            <w:r>
+              <w:rPr>
+                <w:rtl w:val="0"/>
+              </w:rPr>
+              <w:t xml:space="preserve">2026-02-17</w:t>
+            </w:r>
+            <w:r>
+              <w:rPr>
+                <w:rtl w:val="0"/>
+              </w:rPr>
+            </w:r>
+          </w:p>
+        </w:tc>
+        <w:tc>
+          <w:tcPr>
+            <w:vAlign w:val="center"/>
+          </w:tcPr>
+          <w:p>
+            <w:pPr>
+              <w:keepNext w:val="0"/>
+              <w:keepLines w:val="1"/>
+              <w:widowControl w:val="0"/>
+              <w:pBdr>
+                <w:top w:space="0" w:sz="0" w:val="nil"/>
+                <w:left w:space="0" w:sz="0" w:val="nil"/>
+                <w:bottom w:space="0" w:sz="0" w:val="nil"/>
+                <w:right w:space="0" w:sz="0" w:val="nil"/>
+                <w:between w:space="0" w:sz="0" w:val="nil"/>
+              </w:pBdr>
+              <w:shd w:fill="auto" w:val="clear"/>
+              <w:spacing w:after="0" w:before="0" w:line="240" w:lineRule="auto"/>
+              <w:ind w:left="0" w:right="0" w:firstLine="0"/>
+              <w:jc w:val="left"/>
+              <w:rPr>
+                <w:rFonts w:ascii="Times New Roman" w:cs="Times New Roman" w:eastAsia="Times New Roman" w:hAnsi="Times New Roman"/>
+                <w:b w:val="0"/>
+                <w:bCs w:val="0"/>
+                <w:i w:val="0"/>
+                <w:iCs w:val="0"/>
+                <w:smallCaps w:val="0"/>
+                <w:strike w:val="0"/>
+                <w:color w:val="000000"/>
+                <w:sz w:val="20"/>
+                <w:szCs w:val="20"/>
+                <w:u w:val="none"/>
+                <w:shd w:fill="auto" w:val="clear"/>
+                <w:vertAlign w:val="baseline"/>
+              </w:rPr>
+            </w:pPr>
+            <w:r>
+              <w:rPr>
+                <w:rtl w:val="0"/>
+              </w:rPr>
+              <w:t xml:space="preserve">1.1</w:t>
+            </w:r>
+            <w:r>
+              <w:rPr>
+                <w:rtl w:val="0"/>
+              </w:rPr>
+            </w:r>
+          </w:p>
+        </w:tc>
+        <w:tc>
+          <w:tcPr>
+            <w:vAlign w:val="center"/>
+          </w:tcPr>
+          <w:p>
+            <w:pPr>
+              <w:keepNext w:val="0"/>
+              <w:keepLines w:val="1"/>
               <w:widowControl w:val="0"/>
               <w:pBdr>
                 <w:top w:space="0" w:sz="0" w:val="nil"/>
@@ -805,7 +855,62 @@
             <w:pPr>
               <w:keepNext w:val="0"/>
               <w:keepLines w:val="1"/>
-              <w:pageBreakBefore w:val="0"/>
+              <w:widowControl w:val="0"/>
+              <w:pBdr>
+                <w:top w:space="0" w:sz="0" w:val="nil"/>
+                <w:left w:space="0" w:sz="0" w:val="nil"/>
+                <w:bottom w:space="0" w:sz="0" w:val="nil"/>
+                <w:right w:space="0" w:sz="0" w:val="nil"/>
+                <w:between w:space="0" w:sz="0" w:val="nil"/>
+              </w:pBdr>
+              <w:shd w:fill="auto" w:val="clear"/>
+              <w:spacing w:after="0" w:before="0" w:line="240" w:lineRule="auto"/>
+              <w:ind w:left="0" w:right="0" w:firstLine="0"/>
+              <w:jc w:val="left"/>
+              <w:rPr>
+                <w:rFonts w:ascii="Times New Roman" w:cs="Times New Roman" w:eastAsia="Times New Roman" w:hAnsi="Times New Roman"/>
+                <w:b w:val="0"/>
+                <w:bCs w:val="0"/>
+                <w:i w:val="0"/>
+                <w:iCs w:val="0"/>
+                <w:smallCaps w:val="0"/>
+                <w:strike w:val="0"/>
+                <w:color w:val="000000"/>
+                <w:sz w:val="20"/>
+                <w:szCs w:val="20"/>
+                <w:u w:val="none"/>
+                <w:shd w:fill="auto" w:val="clear"/>
+                <w:vertAlign w:val="baseline"/>
+              </w:rPr>
+            </w:pPr>
+            <w:r>
+              <w:rPr>
+                <w:rtl w:val="0"/>
+              </w:rPr>
+              <w:t xml:space="preserve">Isaiah + Group</w:t>
+            </w:r>
+            <w:r>
+              <w:rPr>
+                <w:rtl w:val="0"/>
+              </w:rPr>
+            </w:r>
+          </w:p>
+        </w:tc>
+      </w:tr>
+      <w:tr>
+        <w:trPr>
+          <w:cantSplit w:val="0"/>
+          <w:trHeight w:val="321.0000000000001" w:hRule="atLeast"/>
+          <w:tblHeader w:val="0"/>
+        </w:trPr>
+        <w:tc>
+          <w:tcPr>
+            <w:vAlign w:val="center"/>
+          </w:tcPr>
+          <w:p>
+            <w:pPr>
+              <w:keepNext w:val="0"/>
+              <w:keepLines w:val="1"/>
               <w:widowControl w:val="0"/>
               <w:pBdr>
                 <w:top w:space="0" w:sz="0" w:val="nil"/>
@@ -849,7 +954,6 @@
             <w:pPr>
               <w:keepNext w:val="0"/>
               <w:keepLines w:val="1"/>
-              <w:pageBreakBefore w:val="0"/>
               <w:widowControl w:val="0"/>
               <w:pBdr>
                 <w:top w:space="0" w:sz="0" w:val="nil"/>
@@ -893,7 +997,49 @@
             <w:pPr>
               <w:keepNext w:val="0"/>
               <w:keepLines w:val="1"/>
-              <w:pageBreakBefore w:val="0"/>
+              <w:widowControl w:val="0"/>
+              <w:pBdr>
+                <w:top w:space="0" w:sz="0" w:val="nil"/>
+                <w:left w:space="0" w:sz="0" w:val="nil"/>
+                <w:bottom w:space="0" w:sz="0" w:val="nil"/>
+                <w:right w:space="0" w:sz="0" w:val="nil"/>
+                <w:between w:space="0" w:sz="0" w:val="nil"/>
+              </w:pBdr>
+              <w:shd w:fill="auto" w:val="clear"/>
+              <w:spacing w:after="0" w:before="0" w:line="240" w:lineRule="auto"/>
+              <w:ind w:left="0" w:right="0" w:firstLine="0"/>
+              <w:jc w:val="left"/>
+              <w:rPr>
+                <w:rFonts w:ascii="Times New Roman" w:cs="Times New Roman" w:eastAsia="Times New Roman" w:hAnsi="Times New Roman"/>
+                <w:b w:val="0"/>
+                <w:bCs w:val="0"/>
+                <w:i w:val="0"/>
+                <w:iCs w:val="0"/>
+                <w:smallCaps w:val="0"/>
+                <w:strike w:val="0"/>
+                <w:color w:val="000000"/>
+                <w:sz w:val="20"/>
+                <w:szCs w:val="20"/>
+                <w:u w:val="none"/>
+                <w:shd w:fill="auto" w:val="clear"/>
+                <w:vertAlign w:val="baseline"/>
+              </w:rPr>
+            </w:pPr>
+            <w:r>
+              <w:rPr>
+                <w:rtl w:val="0"/>
+              </w:rPr>
+            </w:r>
+          </w:p>
+        </w:tc>
+        <w:tc>
+          <w:tcPr>
+            <w:vAlign w:val="center"/>
+          </w:tcPr>
+          <w:p>
+            <w:pPr>
+              <w:keepNext w:val="0"/>
+              <w:keepLines w:val="1"/>
               <w:widowControl w:val="0"/>
               <w:pBdr>
                 <w:top w:space="0" w:sz="0" w:val="nil"/>
@@ -944,7 +1090,6 @@
             <w:pPr>
               <w:keepNext w:val="0"/>
               <w:keepLines w:val="1"/>
-              <w:pageBreakBefore w:val="0"/>
               <w:widowControl w:val="0"/>
               <w:pBdr>
                 <w:top w:space="0" w:sz="0" w:val="nil"/>
@@ -988,7 +1133,6 @@
             <w:pPr>
               <w:keepNext w:val="0"/>
               <w:keepLines w:val="1"/>
-              <w:pageBreakBefore w:val="0"/>
               <w:widowControl w:val="0"/>
               <w:pBdr>
                 <w:top w:space="0" w:sz="0" w:val="nil"/>
@@ -1032,7 +1176,6 @@
             <w:pPr>
               <w:keepNext w:val="0"/>
               <w:keepLines w:val="1"/>
-              <w:pageBreakBefore w:val="0"/>
               <w:widowControl w:val="0"/>
               <w:pBdr>
                 <w:top w:space="0" w:sz="0" w:val="nil"/>
@@ -1076,190 +1219,6 @@
             <w:pPr>
               <w:keepNext w:val="0"/>
               <w:keepLines w:val="1"/>
-              <w:pageBreakBefore w:val="0"/>
-              <w:widowControl w:val="0"/>
-              <w:pBdr>
-                <w:top w:space="0" w:sz="0" w:val="nil"/>
-                <w:left w:space="0" w:sz="0" w:val="nil"/>
-                <w:bottom w:space="0" w:sz="0" w:val="nil"/>
-                <w:right w:space="0" w:sz="0" w:val="nil"/>
-                <w:between w:space="0" w:sz="0" w:val="nil"/>
-              </w:pBdr>
-              <w:shd w:fill="auto" w:val="clear"/>
-              <w:spacing w:after="0" w:before="0" w:line="240" w:lineRule="auto"/>
-              <w:ind w:left="0" w:right="0" w:firstLine="0"/>
-              <w:jc w:val="left"/>
-              <w:rPr>
-                <w:rFonts w:ascii="Times New Roman" w:cs="Times New Roman" w:eastAsia="Times New Roman" w:hAnsi="Times New Roman"/>
-                <w:b w:val="0"/>
-                <w:bCs w:val="0"/>
-                <w:i w:val="0"/>
-                <w:iCs w:val="0"/>
-                <w:smallCaps w:val="0"/>
-                <w:strike w:val="0"/>
-                <w:color w:val="000000"/>
-                <w:sz w:val="20"/>
-                <w:szCs w:val="20"/>
-                <w:u w:val="none"/>
-                <w:shd w:fill="auto" w:val="clear"/>
-                <w:vertAlign w:val="baseline"/>
-              </w:rPr>
-            </w:pPr>
-            <w:r>
-              <w:rPr>
-                <w:rtl w:val="0"/>
-              </w:rPr>
-            </w:r>
-          </w:p>
-        </w:tc>
-      </w:tr>
-      <w:tr>
-        <w:trPr>
-          <w:cantSplit w:val="0"/>
-          <w:trHeight w:val="321.0000000000001" w:hRule="atLeast"/>
-          <w:tblHeader w:val="0"/>
-        </w:trPr>
-        <w:tc>
-          <w:tcPr>
-            <w:vAlign w:val="center"/>
-          </w:tcPr>
-          <w:p>
-            <w:pPr>
-              <w:keepNext w:val="0"/>
-              <w:keepLines w:val="1"/>
-              <w:pageBreakBefore w:val="0"/>
-              <w:widowControl w:val="0"/>
-              <w:pBdr>
-                <w:top w:space="0" w:sz="0" w:val="nil"/>
-                <w:left w:space="0" w:sz="0" w:val="nil"/>
-                <w:bottom w:space="0" w:sz="0" w:val="nil"/>
-                <w:right w:space="0" w:sz="0" w:val="nil"/>
-                <w:between w:space="0" w:sz="0" w:val="nil"/>
-              </w:pBdr>
-              <w:shd w:fill="auto" w:val="clear"/>
-              <w:spacing w:after="0" w:before="0" w:line="240" w:lineRule="auto"/>
-              <w:ind w:left="0" w:right="0" w:firstLine="0"/>
-              <w:jc w:val="left"/>
-              <w:rPr>
-                <w:rFonts w:ascii="Times New Roman" w:cs="Times New Roman" w:eastAsia="Times New Roman" w:hAnsi="Times New Roman"/>
-                <w:b w:val="0"/>
-                <w:bCs w:val="0"/>
-                <w:i w:val="0"/>
-                <w:iCs w:val="0"/>
-                <w:smallCaps w:val="0"/>
-                <w:strike w:val="0"/>
-                <w:color w:val="000000"/>
-                <w:sz w:val="20"/>
-                <w:szCs w:val="20"/>
-                <w:u w:val="none"/>
-                <w:shd w:fill="auto" w:val="clear"/>
-                <w:vertAlign w:val="baseline"/>
-              </w:rPr>
-            </w:pPr>
-            <w:r>
-              <w:rPr>
-                <w:rtl w:val="0"/>
-              </w:rPr>
-            </w:r>
-          </w:p>
-        </w:tc>
-        <w:tc>
-          <w:tcPr>
-            <w:vAlign w:val="center"/>
-          </w:tcPr>
-          <w:p>
-            <w:pPr>
-              <w:keepNext w:val="0"/>
-              <w:keepLines w:val="1"/>
-              <w:pageBreakBefore w:val="0"/>
-              <w:widowControl w:val="0"/>
-              <w:pBdr>
-                <w:top w:space="0" w:sz="0" w:val="nil"/>
-                <w:left w:space="0" w:sz="0" w:val="nil"/>
-                <w:bottom w:space="0" w:sz="0" w:val="nil"/>
-                <w:right w:space="0" w:sz="0" w:val="nil"/>
-                <w:between w:space="0" w:sz="0" w:val="nil"/>
-              </w:pBdr>
-              <w:shd w:fill="auto" w:val="clear"/>
-              <w:spacing w:after="0" w:before="0" w:line="240" w:lineRule="auto"/>
-              <w:ind w:left="0" w:right="0" w:firstLine="0"/>
-              <w:jc w:val="left"/>
-              <w:rPr>
-                <w:rFonts w:ascii="Times New Roman" w:cs="Times New Roman" w:eastAsia="Times New Roman" w:hAnsi="Times New Roman"/>
-                <w:b w:val="0"/>
-                <w:bCs w:val="0"/>
-                <w:i w:val="0"/>
-                <w:iCs w:val="0"/>
-                <w:smallCaps w:val="0"/>
-                <w:strike w:val="0"/>
-                <w:color w:val="000000"/>
-                <w:sz w:val="20"/>
-                <w:szCs w:val="20"/>
-                <w:u w:val="none"/>
-                <w:shd w:fill="auto" w:val="clear"/>
-                <w:vertAlign w:val="baseline"/>
-              </w:rPr>
-            </w:pPr>
-            <w:r>
-              <w:rPr>
-                <w:rtl w:val="0"/>
-              </w:rPr>
-            </w:r>
-          </w:p>
-        </w:tc>
-        <w:tc>
-          <w:tcPr>
-            <w:vAlign w:val="center"/>
-          </w:tcPr>
-          <w:p>
-            <w:pPr>
-              <w:keepNext w:val="0"/>
-              <w:keepLines w:val="1"/>
-              <w:pageBreakBefore w:val="0"/>
-              <w:widowControl w:val="0"/>
-              <w:pBdr>
-                <w:top w:space="0" w:sz="0" w:val="nil"/>
-                <w:left w:space="0" w:sz="0" w:val="nil"/>
-                <w:bottom w:space="0" w:sz="0" w:val="nil"/>
-                <w:right w:space="0" w:sz="0" w:val="nil"/>
-                <w:between w:space="0" w:sz="0" w:val="nil"/>
-              </w:pBdr>
-              <w:shd w:fill="auto" w:val="clear"/>
-              <w:spacing w:after="0" w:before="0" w:line="240" w:lineRule="auto"/>
-              <w:ind w:left="0" w:right="0" w:firstLine="0"/>
-              <w:jc w:val="left"/>
-              <w:rPr>
-                <w:rFonts w:ascii="Times New Roman" w:cs="Times New Roman" w:eastAsia="Times New Roman" w:hAnsi="Times New Roman"/>
-                <w:b w:val="0"/>
-                <w:bCs w:val="0"/>
-                <w:i w:val="0"/>
-                <w:iCs w:val="0"/>
-                <w:smallCaps w:val="0"/>
-                <w:strike w:val="0"/>
-                <w:color w:val="000000"/>
-                <w:sz w:val="20"/>
-                <w:szCs w:val="20"/>
-                <w:u w:val="none"/>
-                <w:shd w:fill="auto" w:val="clear"/>
-                <w:vertAlign w:val="baseline"/>
-              </w:rPr>
-            </w:pPr>
-            <w:r>
-              <w:rPr>
-                <w:rtl w:val="0"/>
-              </w:rPr>
-            </w:r>
-          </w:p>
-        </w:tc>
-        <w:tc>
-          <w:tcPr>
-            <w:vAlign w:val="center"/>
-          </w:tcPr>
-          <w:p>
-            <w:pPr>
-              <w:keepNext w:val="0"/>
-              <w:keepLines w:val="1"/>
-              <w:pageBreakBefore w:val="0"/>
               <w:widowControl w:val="0"/>
               <w:pBdr>
                 <w:top w:space="0" w:sz="0" w:val="nil"/>
@@ -1324,7 +1283,7 @@
     </w:p>
     <w:sdt>
       <w:sdtPr>
-        <w:id w:val="-995924705"/>
+        <w:id w:val="1721442361"/>
         <w:docPartObj>
           <w:docPartGallery w:val="Table of Contents"/>
           <w:docPartUnique w:val="1"/>
@@ -5040,6 +4999,7 @@
           <w:ilvl w:val="0"/>
           <w:numId w:val="1"/>
         </w:numPr>
+        <w:ind w:left="0" w:firstLine="0"/>
         <w:rPr/>
       </w:pPr>
       <w:bookmarkStart w:colFirst="0" w:colLast="0" w:name="_heading=h.v67at2af6kss" w:id="1"/>
@@ -5521,6 +5481,7 @@
           <w:ilvl w:val="1"/>
           <w:numId w:val="1"/>
         </w:numPr>
+        <w:ind w:left="0" w:firstLine="0"/>
         <w:rPr/>
       </w:pPr>
       <w:bookmarkStart w:colFirst="0" w:colLast="0" w:name="_heading=h.4pg2qhuesmkr" w:id="2"/>
@@ -5723,6 +5684,7 @@
           <w:ilvl w:val="1"/>
           <w:numId w:val="1"/>
         </w:numPr>
+        <w:ind w:left="0" w:firstLine="0"/>
         <w:rPr/>
       </w:pPr>
       <w:bookmarkStart w:colFirst="0" w:colLast="0" w:name="_heading=h.1ql5pfwsjljp" w:id="3"/>
@@ -5887,6 +5849,7 @@
           <w:ilvl w:val="1"/>
           <w:numId w:val="1"/>
         </w:numPr>
+        <w:ind w:left="0" w:firstLine="0"/>
         <w:rPr/>
       </w:pPr>
       <w:bookmarkStart w:colFirst="0" w:colLast="0" w:name="_heading=h.4kruv0vzni4l" w:id="4"/>
@@ -5952,6 +5915,7 @@
           <w:ilvl w:val="1"/>
           <w:numId w:val="1"/>
         </w:numPr>
+        <w:ind w:left="0" w:firstLine="0"/>
         <w:rPr/>
       </w:pPr>
       <w:bookmarkStart w:colFirst="0" w:colLast="0" w:name="_heading=h.gvrqcjrjctek" w:id="5"/>
@@ -6166,6 +6130,7 @@
           <w:ilvl w:val="1"/>
           <w:numId w:val="1"/>
         </w:numPr>
+        <w:ind w:left="0" w:firstLine="0"/>
         <w:rPr/>
       </w:pPr>
       <w:bookmarkStart w:colFirst="0" w:colLast="0" w:name="_heading=h.ffkmlt86jhgc" w:id="6"/>
@@ -6275,6 +6240,7 @@
           <w:ilvl w:val="0"/>
           <w:numId w:val="1"/>
         </w:numPr>
+        <w:ind w:left="0" w:firstLine="0"/>
         <w:rPr/>
       </w:pPr>
       <w:bookmarkStart w:colFirst="0" w:colLast="0" w:name="_heading=h.1qxyuspe90bd" w:id="7"/>
@@ -6387,6 +6353,7 @@
           <w:ilvl w:val="1"/>
           <w:numId w:val="1"/>
         </w:numPr>
+        <w:ind w:left="0" w:firstLine="0"/>
         <w:rPr/>
       </w:pPr>
       <w:bookmarkStart w:colFirst="0" w:colLast="0" w:name="_heading=h.7e6ca1fq4mee" w:id="8"/>
@@ -6405,6 +6372,7 @@
           <w:ilvl w:val="2"/>
           <w:numId w:val="1"/>
         </w:numPr>
+        <w:ind w:left="0" w:firstLine="0"/>
         <w:rPr>
           <w:highlight w:val="yellow"/>
         </w:rPr>
@@ -6426,6 +6394,7 @@
           <w:ilvl w:val="2"/>
           <w:numId w:val="1"/>
         </w:numPr>
+        <w:ind w:left="0" w:firstLine="0"/>
         <w:rPr/>
       </w:pPr>
       <w:bookmarkStart w:colFirst="0" w:colLast="0" w:name="_heading=h.ig610rirjqkw" w:id="10"/>
@@ -6435,6 +6404,24 @@
           <w:rtl w:val="0"/>
         </w:rPr>
         <w:t xml:space="preserve">User Interfaces</w:t>
+      </w:r>
+    </w:p>
+    <w:p>
+      <w:pPr>
+        <w:spacing w:after="120" w:before="120" w:lineRule="auto"/>
+        <w:ind w:left="763" w:firstLine="0"/>
+        <w:rPr/>
+      </w:pPr>
+      <w:r>
+        <w:rPr>
+          <w:rtl w:val="0"/>
+        </w:rPr>
+        <w:t xml:space="preserve">We plan on using the Godot Engine for the front-end design. This will enable us to create a product that is user-friendly and intuitive to use, and can facilitate our detailed input error highlighting. One of the many benefits to Godot is that the interface can be locally generated and run, so we would not have to rely on an internet connection.</w:t>
+      </w:r>
+      <w:r>
+        <w:rPr>
+          <w:rtl w:val="0"/>
+        </w:rPr>
       </w:r>
     </w:p>
     <w:p>
@@ -6444,6 +6431,7 @@
           <w:ilvl w:val="2"/>
           <w:numId w:val="1"/>
         </w:numPr>
+        <w:ind w:left="0" w:firstLine="0"/>
         <w:rPr>
           <w:highlight w:val="yellow"/>
         </w:rPr>
@@ -6465,6 +6453,7 @@
           <w:ilvl w:val="2"/>
           <w:numId w:val="1"/>
         </w:numPr>
+        <w:ind w:left="0" w:firstLine="0"/>
         <w:rPr/>
       </w:pPr>
       <w:bookmarkStart w:colFirst="0" w:colLast="0" w:name="_heading=h.1u86s1lj4xed" w:id="12"/>
@@ -6474,6 +6463,33 @@
           <w:rtl w:val="0"/>
         </w:rPr>
         <w:t xml:space="preserve">Software Interfaces</w:t>
+      </w:r>
+    </w:p>
+    <w:p>
+      <w:pPr>
+        <w:spacing w:after="120" w:before="120" w:lineRule="auto"/>
+        <w:ind w:left="763" w:firstLine="0"/>
+        <w:rPr/>
+      </w:pPr>
+      <w:r>
+        <w:rPr>
+          <w:rtl w:val="0"/>
+        </w:rPr>
+        <w:t xml:space="preserve">[This section of the </w:t>
+      </w:r>
+      <w:r>
+        <w:rPr>
+          <w:b w:val="1"/>
+          <w:bCs w:val="1"/>
+          <w:rtl w:val="0"/>
+        </w:rPr>
+        <w:t xml:space="preserve">SRS</w:t>
+      </w:r>
+      <w:r>
+        <w:rPr>
+          <w:rtl w:val="0"/>
+        </w:rPr>
+        <w:t xml:space="preserve"> describes the general factors that affect the product and its requirements.  This section does not state specific requirements.  Instead, it provides a background for those requirements, which are defined in detail in Section 3, and makes them easier to understand. Include such items as:</w:t>
       </w:r>
     </w:p>
     <w:p>
@@ -6483,6 +6499,7 @@
           <w:ilvl w:val="2"/>
           <w:numId w:val="1"/>
         </w:numPr>
+        <w:ind w:left="0" w:firstLine="0"/>
         <w:rPr>
           <w:highlight w:val="yellow"/>
         </w:rPr>
@@ -6504,6 +6521,7 @@
           <w:ilvl w:val="2"/>
           <w:numId w:val="1"/>
         </w:numPr>
+        <w:ind w:left="0" w:firstLine="0"/>
         <w:rPr/>
       </w:pPr>
       <w:bookmarkStart w:colFirst="0" w:colLast="0" w:name="_heading=h.3zwlwfw1hl2q" w:id="14"/>
@@ -6513,6 +6531,33 @@
           <w:rtl w:val="0"/>
         </w:rPr>
         <w:t xml:space="preserve">Memory Constraints</w:t>
+      </w:r>
+    </w:p>
+    <w:p>
+      <w:pPr>
+        <w:spacing w:after="120" w:before="120" w:lineRule="auto"/>
+        <w:ind w:left="763" w:firstLine="0"/>
+        <w:rPr/>
+      </w:pPr>
+      <w:r>
+        <w:rPr>
+          <w:rtl w:val="0"/>
+        </w:rPr>
+        <w:t xml:space="preserve">The scope of our software should be small enough that we will not have to worry about memory limitations, however we will have all numerical values in C++’s </w:t>
+      </w:r>
+      <w:r>
+        <w:rPr>
+          <w:rFonts w:ascii="Courier Prime" w:cs="Courier Prime" w:eastAsia="Courier Prime" w:hAnsi="Courier Prime"/>
+          <w:shd w:fill="efefef" w:val="clear"/>
+          <w:rtl w:val="0"/>
+        </w:rPr>
+        <w:t xml:space="preserve"> long double </w:t>
+      </w:r>
+      <w:r>
+        <w:rPr>
+          <w:rtl w:val="0"/>
+        </w:rPr>
+        <w:t xml:space="preserve"> datatype. This is relatively memory hungry for numerical datatypes, but will give us the most precision therefore reducing floating point errors. We also plan on keeping a persistant record of calculations, and this may take significant storage space.</w:t>
       </w:r>
     </w:p>
     <w:p>
@@ -6522,6 +6567,7 @@
           <w:ilvl w:val="2"/>
           <w:numId w:val="1"/>
         </w:numPr>
+        <w:ind w:left="0" w:firstLine="0"/>
         <w:rPr>
           <w:highlight w:val="yellow"/>
         </w:rPr>
@@ -6543,6 +6589,7 @@
           <w:ilvl w:val="1"/>
           <w:numId w:val="1"/>
         </w:numPr>
+        <w:ind w:left="0" w:firstLine="0"/>
         <w:rPr/>
       </w:pPr>
       <w:bookmarkStart w:colFirst="0" w:colLast="0" w:name="_heading=h.d4a3sslxw0u4" w:id="16"/>
@@ -6552,6 +6599,24 @@
           <w:rtl w:val="0"/>
         </w:rPr>
         <w:t xml:space="preserve">Product functions</w:t>
+      </w:r>
+      <w:r>
+        <w:rPr>
+          <w:rtl w:val="0"/>
+        </w:rPr>
+      </w:r>
+    </w:p>
+    <w:p>
+      <w:pPr>
+        <w:spacing w:after="120" w:before="120" w:lineRule="auto"/>
+        <w:ind w:left="763" w:firstLine="0"/>
+        <w:rPr/>
+      </w:pPr>
+      <w:r>
+        <w:rPr>
+          <w:rtl w:val="0"/>
+        </w:rPr>
+        <w:t xml:space="preserve">Generally, our software will preform all arithmetic. For our specific userbase, we will implement random number generators themed as dice, and a persistant history of calculations performed.</w:t>
       </w:r>
     </w:p>
     <w:p>
@@ -6561,6 +6626,7 @@
           <w:ilvl w:val="1"/>
           <w:numId w:val="1"/>
         </w:numPr>
+        <w:ind w:left="0" w:firstLine="0"/>
         <w:rPr/>
       </w:pPr>
       <w:bookmarkStart w:colFirst="0" w:colLast="0" w:name="_heading=h.p4u6sl1pfucu" w:id="17"/>
@@ -6570,6 +6636,24 @@
           <w:rtl w:val="0"/>
         </w:rPr>
         <w:t xml:space="preserve">User characteristics</w:t>
+      </w:r>
+      <w:r>
+        <w:rPr>
+          <w:rtl w:val="0"/>
+        </w:rPr>
+      </w:r>
+    </w:p>
+    <w:p>
+      <w:pPr>
+        <w:spacing w:after="120" w:before="120" w:lineRule="auto"/>
+        <w:ind w:left="763" w:firstLine="0"/>
+        <w:rPr/>
+      </w:pPr>
+      <w:r>
+        <w:rPr>
+          <w:rtl w:val="0"/>
+        </w:rPr>
+        <w:t xml:space="preserve">Our calculator will be geared toward table-top role playing game (TTRPG) calculations.</w:t>
       </w:r>
     </w:p>
     <w:p>
@@ -6579,6 +6663,7 @@
           <w:ilvl w:val="1"/>
           <w:numId w:val="1"/>
         </w:numPr>
+        <w:ind w:left="0" w:firstLine="0"/>
         <w:rPr/>
       </w:pPr>
       <w:bookmarkStart w:colFirst="0" w:colLast="0" w:name="_heading=h.5mgetazce3ag" w:id="18"/>
@@ -6588,6 +6673,45 @@
           <w:rtl w:val="0"/>
         </w:rPr>
         <w:t xml:space="preserve">Constraints</w:t>
+      </w:r>
+      <w:r>
+        <w:rPr>
+          <w:rtl w:val="0"/>
+        </w:rPr>
+      </w:r>
+    </w:p>
+    <w:p>
+      <w:pPr>
+        <w:spacing w:after="120" w:before="120" w:lineRule="auto"/>
+        <w:ind w:left="763" w:firstLine="0"/>
+        <w:rPr>
+          <w:shd w:fill="efefef" w:val="clear"/>
+        </w:rPr>
+      </w:pPr>
+      <w:r>
+        <w:rPr>
+          <w:rtl w:val="0"/>
+        </w:rPr>
+        <w:t xml:space="preserve">The user interface will allow us to limit the possible inputs and the error highlighting can be used to deal with invalid inputs without crashing. Dispite using the </w:t>
+      </w:r>
+      <w:r>
+        <w:rPr>
+          <w:rFonts w:ascii="Courier Prime" w:cs="Courier Prime" w:eastAsia="Courier Prime" w:hAnsi="Courier Prime"/>
+          <w:shd w:fill="efefef" w:val="clear"/>
+          <w:rtl w:val="0"/>
+        </w:rPr>
+        <w:t xml:space="preserve"> long double </w:t>
+      </w:r>
+      <w:r>
+        <w:rPr>
+          <w:rtl w:val="0"/>
+        </w:rPr>
+        <w:t xml:space="preserve"> datatype, we are still constrained by the storage limits of it.</w:t>
+      </w:r>
+      <w:r>
+        <w:rPr>
+          <w:rtl w:val="0"/>
+        </w:rPr>
       </w:r>
     </w:p>
     <w:p>
@@ -6597,6 +6721,7 @@
           <w:ilvl w:val="1"/>
           <w:numId w:val="1"/>
         </w:numPr>
+        <w:ind w:left="0" w:firstLine="0"/>
         <w:rPr/>
       </w:pPr>
       <w:bookmarkStart w:colFirst="0" w:colLast="0" w:name="_heading=h.vaqplx2oq0ev" w:id="19"/>
@@ -6606,6 +6731,24 @@
           <w:rtl w:val="0"/>
         </w:rPr>
         <w:t xml:space="preserve">Assumptions and dependencies</w:t>
+      </w:r>
+      <w:r>
+        <w:rPr>
+          <w:rtl w:val="0"/>
+        </w:rPr>
+      </w:r>
+    </w:p>
+    <w:p>
+      <w:pPr>
+        <w:spacing w:after="120" w:before="120" w:lineRule="auto"/>
+        <w:ind w:left="763" w:firstLine="0"/>
+        <w:rPr/>
+      </w:pPr>
+      <w:r>
+        <w:rPr>
+          <w:rtl w:val="0"/>
+        </w:rPr>
+        <w:t xml:space="preserve">We are depending on GitHub and the Godot Engine for development, but we plan on making the final product a self-contained executable that will function on a variety of operating systems.</w:t>
       </w:r>
     </w:p>
     <w:p>
@@ -6615,6 +6758,7 @@
           <w:ilvl w:val="1"/>
           <w:numId w:val="1"/>
         </w:numPr>
+        <w:ind w:left="0" w:firstLine="0"/>
         <w:rPr>
           <w:highlight w:val="yellow"/>
         </w:rPr>
@@ -6675,6 +6819,7 @@
           <w:ilvl w:val="0"/>
           <w:numId w:val="1"/>
         </w:numPr>
+        <w:ind w:left="0" w:firstLine="0"/>
         <w:rPr/>
       </w:pPr>
       <w:bookmarkStart w:colFirst="0" w:colLast="0" w:name="_heading=h.yv5pskr38c37" w:id="21"/>
@@ -6784,6 +6929,7 @@
           <w:ilvl w:val="1"/>
           <w:numId w:val="1"/>
         </w:numPr>
+        <w:ind w:left="0" w:firstLine="0"/>
         <w:rPr/>
       </w:pPr>
       <w:bookmarkStart w:colFirst="0" w:colLast="0" w:name="_heading=h.j44mm8rqqljt" w:id="22"/>
@@ -6946,6 +7092,7 @@
           <w:ilvl w:val="2"/>
           <w:numId w:val="1"/>
         </w:numPr>
+        <w:ind w:left="0" w:firstLine="0"/>
         <w:rPr/>
       </w:pPr>
       <w:bookmarkStart w:colFirst="0" w:colLast="0" w:name="_heading=h.kfn6mv5ssp09" w:id="23"/>
@@ -7017,6 +7164,7 @@
           <w:ilvl w:val="1"/>
           <w:numId w:val="1"/>
         </w:numPr>
+        <w:ind w:left="0" w:firstLine="0"/>
         <w:rPr/>
       </w:pPr>
       <w:bookmarkStart w:colFirst="0" w:colLast="0" w:name="_heading=h.kenqh4c2r99t" w:id="24"/>
@@ -7088,6 +7236,7 @@
           <w:ilvl w:val="1"/>
           <w:numId w:val="1"/>
         </w:numPr>
+        <w:ind w:left="0" w:firstLine="0"/>
         <w:rPr/>
       </w:pPr>
       <w:bookmarkStart w:colFirst="0" w:colLast="0" w:name="_heading=h.xsg02ecrvnqu" w:id="25"/>
@@ -7198,6 +7347,7 @@
           <w:ilvl w:val="0"/>
           <w:numId w:val="1"/>
         </w:numPr>
+        <w:ind w:left="0" w:firstLine="0"/>
         <w:rPr/>
       </w:pPr>
       <w:bookmarkStart w:colFirst="0" w:colLast="0" w:name="_heading=h.aksn34jf1zx6" w:id="26"/>
@@ -7348,7 +7498,6 @@
             <w:pPr>
               <w:keepNext w:val="0"/>
               <w:keepLines w:val="0"/>
-              <w:pageBreakBefore w:val="0"/>
               <w:widowControl w:val="0"/>
               <w:pBdr>
                 <w:top w:space="0" w:sz="0" w:val="nil"/>
@@ -7416,7 +7565,6 @@
             <w:pPr>
               <w:keepNext w:val="0"/>
               <w:keepLines w:val="0"/>
-              <w:pageBreakBefore w:val="0"/>
               <w:widowControl w:val="0"/>
               <w:pBdr>
                 <w:top w:space="0" w:sz="0" w:val="nil"/>
@@ -7507,7 +7655,6 @@
             <w:pPr>
               <w:keepNext w:val="0"/>
               <w:keepLines w:val="0"/>
-              <w:pageBreakBefore w:val="0"/>
               <w:widowControl w:val="0"/>
               <w:pBdr>
                 <w:top w:space="0" w:sz="0" w:val="nil"/>
@@ -7582,7 +7729,6 @@
             <w:pPr>
               <w:keepNext w:val="0"/>
               <w:keepLines w:val="0"/>
-              <w:pageBreakBefore w:val="0"/>
               <w:widowControl w:val="0"/>
               <w:pBdr>
                 <w:top w:space="0" w:sz="0" w:val="nil"/>
@@ -7670,6 +7816,7 @@
           <w:ilvl w:val="0"/>
           <w:numId w:val="1"/>
         </w:numPr>
+        <w:ind w:left="0" w:firstLine="0"/>
         <w:rPr/>
       </w:pPr>
       <w:bookmarkStart w:colFirst="0" w:colLast="0" w:name="_heading=h.fv3ngwtnasqq" w:id="27"/>
@@ -7802,7 +7949,6 @@
     <w:pPr>
       <w:keepNext w:val="0"/>
       <w:keepLines w:val="0"/>
-      <w:pageBreakBefore w:val="0"/>
       <w:widowControl w:val="0"/>
       <w:pBdr>
         <w:top w:space="0" w:sz="0" w:val="nil"/>
@@ -7866,7 +8012,6 @@
     <w:pPr>
       <w:keepNext w:val="0"/>
       <w:keepLines w:val="0"/>
-      <w:pageBreakBefore w:val="0"/>
       <w:widowControl w:val="0"/>
       <w:pBdr>
         <w:top w:space="0" w:sz="0" w:val="nil"/>
@@ -7914,7 +8059,6 @@
     <w:pPr>
       <w:keepNext w:val="0"/>
       <w:keepLines w:val="0"/>
-      <w:pageBreakBefore w:val="0"/>
       <w:widowControl w:val="0"/>
       <w:pBdr>
         <w:top w:space="0" w:sz="0" w:val="nil"/>
@@ -8087,7 +8231,6 @@
     <w:pPr>
       <w:keepNext w:val="0"/>
       <w:keepLines w:val="0"/>
-      <w:pageBreakBefore w:val="0"/>
       <w:widowControl w:val="0"/>
       <w:pBdr>
         <w:top w:space="0" w:sz="0" w:val="nil"/>
@@ -8135,7 +8278,6 @@
     <w:pPr>
       <w:keepNext w:val="0"/>
       <w:keepLines w:val="0"/>
-      <w:pageBreakBefore w:val="0"/>
       <w:widowControl w:val="0"/>
       <w:pBdr>
         <w:top w:space="0" w:sz="0" w:val="nil"/>
@@ -8268,7 +8410,6 @@
     <w:pPr>
       <w:keepNext w:val="0"/>
       <w:keepLines w:val="0"/>
-      <w:pageBreakBefore w:val="0"/>
       <w:widowControl w:val="0"/>
       <w:pBdr>
         <w:top w:space="0" w:sz="0" w:val="nil"/>
@@ -8316,7 +8457,6 @@
     <w:pPr>
       <w:keepNext w:val="0"/>
       <w:keepLines w:val="0"/>
-      <w:pageBreakBefore w:val="0"/>
       <w:widowControl w:val="0"/>
       <w:pBdr>
         <w:top w:space="0" w:sz="0" w:val="nil"/>
@@ -8419,7 +8559,7 @@
             </w:rPr>
             <w:t xml:space="preserve">  Version:</w:t>
             <w:tab/>
-            <w:t xml:space="preserve">1.0</w:t>
+            <w:t xml:space="preserve">1.1</w:t>
           </w:r>
         </w:p>
       </w:tc>
@@ -8464,7 +8604,7 @@
             </w:rPr>
             <w:t xml:space="preserve">  Date:</w:t>
             <w:tab/>
-            <w:t xml:space="preserve">2026-02-10</w:t>
+            <w:t xml:space="preserve">2026-02-17</w:t>
           </w:r>
         </w:p>
       </w:tc>
@@ -8474,7 +8614,6 @@
     <w:pPr>
       <w:keepNext w:val="0"/>
       <w:keepLines w:val="0"/>
-      <w:pageBreakBefore w:val="0"/>
       <w:widowControl w:val="0"/>
       <w:pBdr>
         <w:top w:space="0" w:sz="0" w:val="nil"/>
@@ -8522,7 +8661,6 @@
     <w:pPr>
       <w:keepNext w:val="0"/>
       <w:keepLines w:val="0"/>
-      <w:pageBreakBefore w:val="0"/>
       <w:widowControl w:val="0"/>
       <w:pBdr>
         <w:top w:space="0" w:sz="0" w:val="nil"/>
@@ -8799,6 +8937,20 @@
       <w:sz w:val="36"/>
       <w:szCs w:val="36"/>
     </w:rPr>
+  </w:style>
+  <w:style w:type="table" w:styleId="TableNormal" w:default="1">
+    <w:name w:val="TableNormal"/>
+    <w:tblPr>
+      <w:tblCellMar>
+        <w:top w:w="100.0" w:type="dxa"/>
+        <w:left w:w="100.0" w:type="dxa"/>
+        <w:bottom w:w="100.0" w:type="dxa"/>
+        <w:right w:w="100.0" w:type="dxa"/>
+      </w:tblCellMar>
+    </w:tblPr>
+  </w:style>
+  <w:style w:type="paragraph" w:styleId="Normal" w:default="1">
+    <w:name w:val="normal"/>
   </w:style>
   <w:style w:type="paragraph" w:styleId="Heading7">
     <w:name w:val="heading 7"/>
@@ -9211,6 +9363,58 @@
       <w:bCs w:val="1"/>
     </w:rPr>
   </w:style>
+  <w:style w:type="table" w:styleId="Table1">
+    <w:basedOn w:val="TableNormal"/>
+    <w:tblPr>
+      <w:tblStyleRowBandSize w:val="1"/>
+      <w:tblStyleColBandSize w:val="1"/>
+      <w:tblCellMar>
+        <w:top w:w="0.0" w:type="dxa"/>
+        <w:left w:w="115.0" w:type="dxa"/>
+        <w:bottom w:w="0.0" w:type="dxa"/>
+        <w:right w:w="115.0" w:type="dxa"/>
+      </w:tblCellMar>
+    </w:tblPr>
+  </w:style>
+  <w:style w:type="table" w:styleId="Table2">
+    <w:basedOn w:val="TableNormal"/>
+    <w:tblPr>
+      <w:tblStyleRowBandSize w:val="1"/>
+      <w:tblStyleColBandSize w:val="1"/>
+      <w:tblCellMar>
+        <w:top w:w="0.0" w:type="dxa"/>
+        <w:left w:w="70.0" w:type="dxa"/>
+        <w:bottom w:w="0.0" w:type="dxa"/>
+        <w:right w:w="70.0" w:type="dxa"/>
+      </w:tblCellMar>
+    </w:tblPr>
+  </w:style>
+  <w:style w:type="table" w:styleId="Table3">
+    <w:basedOn w:val="TableNormal"/>
+    <w:tblPr>
+      <w:tblStyleRowBandSize w:val="1"/>
+      <w:tblStyleColBandSize w:val="1"/>
+      <w:tblCellMar>
+        <w:top w:w="0.0" w:type="dxa"/>
+        <w:left w:w="115.0" w:type="dxa"/>
+        <w:bottom w:w="0.0" w:type="dxa"/>
+        <w:right w:w="115.0" w:type="dxa"/>
+      </w:tblCellMar>
+    </w:tblPr>
+  </w:style>
+  <w:style w:type="table" w:styleId="Table4">
+    <w:basedOn w:val="TableNormal"/>
+    <w:tblPr>
+      <w:tblStyleRowBandSize w:val="1"/>
+      <w:tblStyleColBandSize w:val="1"/>
+      <w:tblCellMar>
+        <w:top w:w="0.0" w:type="dxa"/>
+        <w:left w:w="115.0" w:type="dxa"/>
+        <w:bottom w:w="0.0" w:type="dxa"/>
+        <w:right w:w="115.0" w:type="dxa"/>
+      </w:tblCellMar>
+    </w:tblPr>
+  </w:style>
   <w:style w:type="paragraph" w:styleId="Subtitle">
     <w:name w:val="Subtitle"/>
     <w:basedOn w:val="Normal"/>
@@ -9579,7 +9783,7 @@
 
 <file path=customXML/item1.xml><?xml version="1.0" encoding="utf-8"?>
 <go:gDocsCustomXmlDataStorage xmlns:go="http://customooxmlschemas.google.com/" xmlns:r="http://schemas.openxmlformats.org/officeDocument/2006/relationships" uri="GoogleDocsCustomDataVersion2">
-  <go:docsCustomData xmlns:go="http://customooxmlschemas.google.com/" roundtripDataSignature="AMtx7mgKCHV4NeVQfAiFmSpQYvWaxtrmSA==">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</go:docsCustomData>
+  <go:docsCustomData xmlns:go="http://customooxmlschemas.google.com/" roundtripDataSignature="AMtx7mjoqIWBMrq03Qd5BbCy4HxSqr6zOg==">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</go:docsCustomData>
 </go:gDocsCustomXmlDataStorage>
 </file>
 

</xml_diff>

<commit_message>
Software Requirements Ver 1.2
</commit_message>
<xml_diff>
--- a/doc/Calculatorz_Software_Requirements_Specifications.docx
+++ b/doc/Calculatorz_Software_Requirements_Specifications.docx
@@ -77,7 +77,7 @@
           <w:szCs w:val="28"/>
           <w:rtl w:val="0"/>
         </w:rPr>
-        <w:t xml:space="preserve">Version 1.1</w:t>
+        <w:t xml:space="preserve">Version 1.2</w:t>
       </w:r>
     </w:p>
     <w:p>
@@ -844,6 +844,12 @@
               <w:rPr>
                 <w:rtl w:val="0"/>
               </w:rPr>
+              <w:t xml:space="preserve">Drafted Overall Requirements</w:t>
+            </w:r>
+            <w:r>
+              <w:rPr>
+                <w:rtl w:val="0"/>
+              </w:rPr>
             </w:r>
           </w:p>
         </w:tc>
@@ -943,9 +949,169 @@
               <w:rPr>
                 <w:rtl w:val="0"/>
               </w:rPr>
+              <w:t xml:space="preserve">2026-02-24</w:t>
+            </w:r>
+            <w:r>
+              <w:rPr>
+                <w:rtl w:val="0"/>
+              </w:rPr>
             </w:r>
           </w:p>
         </w:tc>
+        <w:tc>
+          <w:tcPr>
+            <w:vAlign w:val="center"/>
+          </w:tcPr>
+          <w:p>
+            <w:pPr>
+              <w:keepNext w:val="0"/>
+              <w:keepLines w:val="1"/>
+              <w:widowControl w:val="0"/>
+              <w:pBdr>
+                <w:top w:space="0" w:sz="0" w:val="nil"/>
+                <w:left w:space="0" w:sz="0" w:val="nil"/>
+                <w:bottom w:space="0" w:sz="0" w:val="nil"/>
+                <w:right w:space="0" w:sz="0" w:val="nil"/>
+                <w:between w:space="0" w:sz="0" w:val="nil"/>
+              </w:pBdr>
+              <w:shd w:fill="auto" w:val="clear"/>
+              <w:spacing w:after="0" w:before="0" w:line="240" w:lineRule="auto"/>
+              <w:ind w:left="0" w:right="0" w:firstLine="0"/>
+              <w:jc w:val="left"/>
+              <w:rPr>
+                <w:rFonts w:ascii="Times New Roman" w:cs="Times New Roman" w:eastAsia="Times New Roman" w:hAnsi="Times New Roman"/>
+                <w:b w:val="0"/>
+                <w:bCs w:val="0"/>
+                <w:i w:val="0"/>
+                <w:iCs w:val="0"/>
+                <w:smallCaps w:val="0"/>
+                <w:strike w:val="0"/>
+                <w:color w:val="000000"/>
+                <w:sz w:val="20"/>
+                <w:szCs w:val="20"/>
+                <w:u w:val="none"/>
+                <w:shd w:fill="auto" w:val="clear"/>
+                <w:vertAlign w:val="baseline"/>
+              </w:rPr>
+            </w:pPr>
+            <w:r>
+              <w:rPr>
+                <w:rtl w:val="0"/>
+              </w:rPr>
+              <w:t xml:space="preserve">1.2</w:t>
+            </w:r>
+            <w:r>
+              <w:rPr>
+                <w:rtl w:val="0"/>
+              </w:rPr>
+            </w:r>
+          </w:p>
+        </w:tc>
+        <w:tc>
+          <w:tcPr>
+            <w:vAlign w:val="center"/>
+          </w:tcPr>
+          <w:p>
+            <w:pPr>
+              <w:keepNext w:val="0"/>
+              <w:keepLines w:val="1"/>
+              <w:widowControl w:val="0"/>
+              <w:pBdr>
+                <w:top w:space="0" w:sz="0" w:val="nil"/>
+                <w:left w:space="0" w:sz="0" w:val="nil"/>
+                <w:bottom w:space="0" w:sz="0" w:val="nil"/>
+                <w:right w:space="0" w:sz="0" w:val="nil"/>
+                <w:between w:space="0" w:sz="0" w:val="nil"/>
+              </w:pBdr>
+              <w:shd w:fill="auto" w:val="clear"/>
+              <w:spacing w:after="0" w:before="0" w:line="240" w:lineRule="auto"/>
+              <w:ind w:left="0" w:right="0" w:firstLine="0"/>
+              <w:jc w:val="left"/>
+              <w:rPr>
+                <w:rFonts w:ascii="Times New Roman" w:cs="Times New Roman" w:eastAsia="Times New Roman" w:hAnsi="Times New Roman"/>
+                <w:b w:val="0"/>
+                <w:bCs w:val="0"/>
+                <w:i w:val="0"/>
+                <w:iCs w:val="0"/>
+                <w:smallCaps w:val="0"/>
+                <w:strike w:val="0"/>
+                <w:color w:val="000000"/>
+                <w:sz w:val="20"/>
+                <w:szCs w:val="20"/>
+                <w:u w:val="none"/>
+                <w:shd w:fill="auto" w:val="clear"/>
+                <w:vertAlign w:val="baseline"/>
+              </w:rPr>
+            </w:pPr>
+            <w:r>
+              <w:rPr>
+                <w:rtl w:val="0"/>
+              </w:rPr>
+              <w:t xml:space="preserve">Drafted Functionality</w:t>
+            </w:r>
+            <w:r>
+              <w:rPr>
+                <w:rtl w:val="0"/>
+              </w:rPr>
+            </w:r>
+          </w:p>
+        </w:tc>
+        <w:tc>
+          <w:tcPr>
+            <w:vAlign w:val="center"/>
+          </w:tcPr>
+          <w:p>
+            <w:pPr>
+              <w:keepNext w:val="0"/>
+              <w:keepLines w:val="1"/>
+              <w:widowControl w:val="0"/>
+              <w:pBdr>
+                <w:top w:space="0" w:sz="0" w:val="nil"/>
+                <w:left w:space="0" w:sz="0" w:val="nil"/>
+                <w:bottom w:space="0" w:sz="0" w:val="nil"/>
+                <w:right w:space="0" w:sz="0" w:val="nil"/>
+                <w:between w:space="0" w:sz="0" w:val="nil"/>
+              </w:pBdr>
+              <w:shd w:fill="auto" w:val="clear"/>
+              <w:spacing w:after="0" w:before="0" w:line="240" w:lineRule="auto"/>
+              <w:ind w:left="0" w:right="0" w:firstLine="0"/>
+              <w:jc w:val="left"/>
+              <w:rPr>
+                <w:rFonts w:ascii="Times New Roman" w:cs="Times New Roman" w:eastAsia="Times New Roman" w:hAnsi="Times New Roman"/>
+                <w:b w:val="0"/>
+                <w:bCs w:val="0"/>
+                <w:i w:val="0"/>
+                <w:iCs w:val="0"/>
+                <w:smallCaps w:val="0"/>
+                <w:strike w:val="0"/>
+                <w:color w:val="000000"/>
+                <w:sz w:val="20"/>
+                <w:szCs w:val="20"/>
+                <w:u w:val="none"/>
+                <w:shd w:fill="auto" w:val="clear"/>
+                <w:vertAlign w:val="baseline"/>
+              </w:rPr>
+            </w:pPr>
+            <w:r>
+              <w:rPr>
+                <w:rtl w:val="0"/>
+              </w:rPr>
+              <w:t xml:space="preserve">Isaiah + Group</w:t>
+            </w:r>
+            <w:r>
+              <w:rPr>
+                <w:rtl w:val="0"/>
+              </w:rPr>
+            </w:r>
+          </w:p>
+        </w:tc>
+      </w:tr>
+      <w:tr>
+        <w:trPr>
+          <w:cantSplit w:val="0"/>
+          <w:trHeight w:val="321.0000000000001" w:hRule="atLeast"/>
+          <w:tblHeader w:val="0"/>
+        </w:trPr>
         <w:tc>
           <w:tcPr>
             <w:vAlign w:val="center"/>
@@ -1075,142 +1241,6 @@
             </w:r>
           </w:p>
         </w:tc>
-      </w:tr>
-      <w:tr>
-        <w:trPr>
-          <w:cantSplit w:val="0"/>
-          <w:trHeight w:val="321.0000000000001" w:hRule="atLeast"/>
-          <w:tblHeader w:val="0"/>
-        </w:trPr>
-        <w:tc>
-          <w:tcPr>
-            <w:vAlign w:val="center"/>
-          </w:tcPr>
-          <w:p>
-            <w:pPr>
-              <w:keepNext w:val="0"/>
-              <w:keepLines w:val="1"/>
-              <w:widowControl w:val="0"/>
-              <w:pBdr>
-                <w:top w:space="0" w:sz="0" w:val="nil"/>
-                <w:left w:space="0" w:sz="0" w:val="nil"/>
-                <w:bottom w:space="0" w:sz="0" w:val="nil"/>
-                <w:right w:space="0" w:sz="0" w:val="nil"/>
-                <w:between w:space="0" w:sz="0" w:val="nil"/>
-              </w:pBdr>
-              <w:shd w:fill="auto" w:val="clear"/>
-              <w:spacing w:after="0" w:before="0" w:line="240" w:lineRule="auto"/>
-              <w:ind w:left="0" w:right="0" w:firstLine="0"/>
-              <w:jc w:val="left"/>
-              <w:rPr>
-                <w:rFonts w:ascii="Times New Roman" w:cs="Times New Roman" w:eastAsia="Times New Roman" w:hAnsi="Times New Roman"/>
-                <w:b w:val="0"/>
-                <w:bCs w:val="0"/>
-                <w:i w:val="0"/>
-                <w:iCs w:val="0"/>
-                <w:smallCaps w:val="0"/>
-                <w:strike w:val="0"/>
-                <w:color w:val="000000"/>
-                <w:sz w:val="20"/>
-                <w:szCs w:val="20"/>
-                <w:u w:val="none"/>
-                <w:shd w:fill="auto" w:val="clear"/>
-                <w:vertAlign w:val="baseline"/>
-              </w:rPr>
-            </w:pPr>
-            <w:r>
-              <w:rPr>
-                <w:rtl w:val="0"/>
-              </w:rPr>
-            </w:r>
-          </w:p>
-        </w:tc>
-        <w:tc>
-          <w:tcPr>
-            <w:vAlign w:val="center"/>
-          </w:tcPr>
-          <w:p>
-            <w:pPr>
-              <w:keepNext w:val="0"/>
-              <w:keepLines w:val="1"/>
-              <w:widowControl w:val="0"/>
-              <w:pBdr>
-                <w:top w:space="0" w:sz="0" w:val="nil"/>
-                <w:left w:space="0" w:sz="0" w:val="nil"/>
-                <w:bottom w:space="0" w:sz="0" w:val="nil"/>
-                <w:right w:space="0" w:sz="0" w:val="nil"/>
-                <w:between w:space="0" w:sz="0" w:val="nil"/>
-              </w:pBdr>
-              <w:shd w:fill="auto" w:val="clear"/>
-              <w:spacing w:after="0" w:before="0" w:line="240" w:lineRule="auto"/>
-              <w:ind w:left="0" w:right="0" w:firstLine="0"/>
-              <w:jc w:val="left"/>
-              <w:rPr>
-                <w:rFonts w:ascii="Times New Roman" w:cs="Times New Roman" w:eastAsia="Times New Roman" w:hAnsi="Times New Roman"/>
-                <w:b w:val="0"/>
-                <w:bCs w:val="0"/>
-                <w:i w:val="0"/>
-                <w:iCs w:val="0"/>
-                <w:smallCaps w:val="0"/>
-                <w:strike w:val="0"/>
-                <w:color w:val="000000"/>
-                <w:sz w:val="20"/>
-                <w:szCs w:val="20"/>
-                <w:u w:val="none"/>
-                <w:shd w:fill="auto" w:val="clear"/>
-                <w:vertAlign w:val="baseline"/>
-              </w:rPr>
-            </w:pPr>
-            <w:r>
-              <w:rPr>
-                <w:rtl w:val="0"/>
-              </w:rPr>
-            </w:r>
-          </w:p>
-        </w:tc>
-        <w:tc>
-          <w:tcPr>
-            <w:vAlign w:val="center"/>
-          </w:tcPr>
-          <w:p>
-            <w:pPr>
-              <w:keepNext w:val="0"/>
-              <w:keepLines w:val="1"/>
-              <w:widowControl w:val="0"/>
-              <w:pBdr>
-                <w:top w:space="0" w:sz="0" w:val="nil"/>
-                <w:left w:space="0" w:sz="0" w:val="nil"/>
-                <w:bottom w:space="0" w:sz="0" w:val="nil"/>
-                <w:right w:space="0" w:sz="0" w:val="nil"/>
-                <w:between w:space="0" w:sz="0" w:val="nil"/>
-              </w:pBdr>
-              <w:shd w:fill="auto" w:val="clear"/>
-              <w:spacing w:after="0" w:before="0" w:line="240" w:lineRule="auto"/>
-              <w:ind w:left="0" w:right="0" w:firstLine="0"/>
-              <w:jc w:val="left"/>
-              <w:rPr>
-                <w:rFonts w:ascii="Times New Roman" w:cs="Times New Roman" w:eastAsia="Times New Roman" w:hAnsi="Times New Roman"/>
-                <w:b w:val="0"/>
-                <w:bCs w:val="0"/>
-                <w:i w:val="0"/>
-                <w:iCs w:val="0"/>
-                <w:smallCaps w:val="0"/>
-                <w:strike w:val="0"/>
-                <w:color w:val="000000"/>
-                <w:sz w:val="20"/>
-                <w:szCs w:val="20"/>
-                <w:u w:val="none"/>
-                <w:shd w:fill="auto" w:val="clear"/>
-                <w:vertAlign w:val="baseline"/>
-              </w:rPr>
-            </w:pPr>
-            <w:r>
-              <w:rPr>
-                <w:rtl w:val="0"/>
-              </w:rPr>
-            </w:r>
-          </w:p>
-        </w:tc>
         <w:tc>
           <w:tcPr>
             <w:vAlign w:val="center"/>
@@ -1283,7 +1313,7 @@
     </w:p>
     <w:sdt>
       <w:sdtPr>
-        <w:id w:val="1721442361"/>
+        <w:id w:val="2096130667"/>
         <w:docPartObj>
           <w:docPartGallery w:val="Table of Contents"/>
           <w:docPartUnique w:val="1"/>
@@ -5719,7 +5749,7 @@
         <w:rPr>
           <w:rtl w:val="0"/>
         </w:rPr>
-        <w:t xml:space="preserve">The software will have a basic user interface for inputs. Underneath will be a tokenizer module, a Prioritization module, then an evaluator module, these will carryout the primary function of our program.</w:t>
+        <w:t xml:space="preserve">The software will have a basic user interface for inputs and an error highlighter watching the whole program for thrown errors. Underneath will be a tokenizer module, a Prioritizer module, then an evaluator module; these will carryout the primary function of our program.</w:t>
       </w:r>
     </w:p>
     <w:p>
@@ -6418,11 +6448,6 @@
         </w:rPr>
         <w:t xml:space="preserve">We plan on using the Godot Engine for the front-end design. This will enable us to create a product that is user-friendly and intuitive to use, and can facilitate our detailed input error highlighting. One of the many benefits to Godot is that the interface can be locally generated and run, so we would not have to rely on an internet connection.</w:t>
       </w:r>
-      <w:r>
-        <w:rPr>
-          <w:rtl w:val="0"/>
-        </w:rPr>
-      </w:r>
     </w:p>
     <w:p>
       <w:pPr>
@@ -6557,7 +6582,7 @@
         <w:rPr>
           <w:rtl w:val="0"/>
         </w:rPr>
-        <w:t xml:space="preserve"> datatype. This is relatively memory hungry for numerical datatypes, but will give us the most precision therefore reducing floating point errors. We also plan on keeping a persistant record of calculations, and this may take significant storage space.</w:t>
+        <w:t xml:space="preserve"> datatype. This is relatively memory hungry for numerical datatypes, but will give us the most precision therefore reducing floating point errors. We also plan on keeping a persistent record of calculations, and this may take significant storage space.</w:t>
       </w:r>
     </w:p>
     <w:p>
@@ -6600,11 +6625,6 @@
         </w:rPr>
         <w:t xml:space="preserve">Product functions</w:t>
       </w:r>
-      <w:r>
-        <w:rPr>
-          <w:rtl w:val="0"/>
-        </w:rPr>
-      </w:r>
     </w:p>
     <w:p>
       <w:pPr>
@@ -6616,7 +6636,7 @@
         <w:rPr>
           <w:rtl w:val="0"/>
         </w:rPr>
-        <w:t xml:space="preserve">Generally, our software will preform all arithmetic. For our specific userbase, we will implement random number generators themed as dice, and a persistant history of calculations performed.</w:t>
+        <w:t xml:space="preserve">Generally, our software will perform all arithmetic. For our specific userbase, we will implement random number generators themed as dice, and a persistent history of calculations performed.</w:t>
       </w:r>
     </w:p>
     <w:p>
@@ -6637,11 +6657,6 @@
         </w:rPr>
         <w:t xml:space="preserve">User characteristics</w:t>
       </w:r>
-      <w:r>
-        <w:rPr>
-          <w:rtl w:val="0"/>
-        </w:rPr>
-      </w:r>
     </w:p>
     <w:p>
       <w:pPr>
@@ -6674,11 +6689,6 @@
         </w:rPr>
         <w:t xml:space="preserve">Constraints</w:t>
       </w:r>
-      <w:r>
-        <w:rPr>
-          <w:rtl w:val="0"/>
-        </w:rPr>
-      </w:r>
     </w:p>
     <w:p>
       <w:pPr>
@@ -6731,11 +6741,6 @@
           <w:rtl w:val="0"/>
         </w:rPr>
         <w:t xml:space="preserve">Assumptions and dependencies</w:t>
-      </w:r>
-      <w:r>
-        <w:rPr>
-          <w:rtl w:val="0"/>
-        </w:rPr>
       </w:r>
     </w:p>
     <w:p>
@@ -6958,78 +6963,13 @@
         <w:spacing w:after="120" w:before="120" w:line="240" w:lineRule="auto"/>
         <w:ind w:left="763" w:right="0" w:firstLine="0"/>
         <w:jc w:val="left"/>
-        <w:rPr>
-          <w:rFonts w:ascii="Times New Roman" w:cs="Times New Roman" w:eastAsia="Times New Roman" w:hAnsi="Times New Roman"/>
-          <w:b w:val="0"/>
-          <w:bCs w:val="0"/>
-          <w:i w:val="1"/>
-          <w:iCs w:val="1"/>
-          <w:smallCaps w:val="0"/>
-          <w:strike w:val="0"/>
-          <w:color w:val="0000ff"/>
-          <w:sz w:val="20"/>
-          <w:szCs w:val="20"/>
-          <w:u w:val="none"/>
-          <w:shd w:fill="auto" w:val="clear"/>
-          <w:vertAlign w:val="baseline"/>
-        </w:rPr>
+        <w:rPr/>
       </w:pPr>
       <w:r>
         <w:rPr>
-          <w:rFonts w:ascii="Times New Roman" w:cs="Times New Roman" w:eastAsia="Times New Roman" w:hAnsi="Times New Roman"/>
-          <w:b w:val="0"/>
-          <w:bCs w:val="0"/>
-          <w:i w:val="1"/>
-          <w:iCs w:val="1"/>
-          <w:smallCaps w:val="0"/>
-          <w:strike w:val="0"/>
-          <w:color w:val="0000ff"/>
-          <w:sz w:val="20"/>
-          <w:szCs w:val="20"/>
-          <w:u w:val="none"/>
-          <w:shd w:fill="auto" w:val="clear"/>
-          <w:vertAlign w:val="baseline"/>
-          <w:rtl w:val="0"/>
-        </w:rPr>
-        <w:t xml:space="preserve">[This section describes the functional requirements of the system for those requirements that are expressed in the natural language style. For many applications, this may constitute the bulk of the </w:t>
-      </w:r>
-      <w:r>
-        <w:rPr>
-          <w:rFonts w:ascii="Times New Roman" w:cs="Times New Roman" w:eastAsia="Times New Roman" w:hAnsi="Times New Roman"/>
-          <w:b w:val="1"/>
-          <w:bCs w:val="1"/>
-          <w:i w:val="1"/>
-          <w:iCs w:val="1"/>
-          <w:smallCaps w:val="0"/>
-          <w:strike w:val="0"/>
-          <w:color w:val="0000ff"/>
-          <w:sz w:val="20"/>
-          <w:szCs w:val="20"/>
-          <w:u w:val="none"/>
-          <w:shd w:fill="auto" w:val="clear"/>
-          <w:vertAlign w:val="baseline"/>
-          <w:rtl w:val="0"/>
-        </w:rPr>
-        <w:t xml:space="preserve">SRS</w:t>
-      </w:r>
-      <w:r>
-        <w:rPr>
-          <w:rFonts w:ascii="Times New Roman" w:cs="Times New Roman" w:eastAsia="Times New Roman" w:hAnsi="Times New Roman"/>
-          <w:b w:val="0"/>
-          <w:bCs w:val="0"/>
-          <w:i w:val="1"/>
-          <w:iCs w:val="1"/>
-          <w:smallCaps w:val="0"/>
-          <w:strike w:val="0"/>
-          <w:color w:val="0000ff"/>
-          <w:sz w:val="20"/>
-          <w:szCs w:val="20"/>
-          <w:u w:val="none"/>
-          <w:shd w:fill="auto" w:val="clear"/>
-          <w:vertAlign w:val="baseline"/>
-          <w:rtl w:val="0"/>
-        </w:rPr>
-        <w:t xml:space="preserve"> package and thought should be given to the organization of this section. This section is typically organized by feature, but alternative organization methods may also be appropriate; for example, organization by user or organization by subsystem. Functional requirements may include feature sets, capabilities, and security.</w:t>
+          <w:rtl w:val="0"/>
+        </w:rPr>
+        <w:t xml:space="preserve">The core computation process in order is: Tokenization, Prioritization, and then Evaluation. Throughout the core process, the User Interface and Error Highlighting will update to reflect the state of the computation.</w:t>
       </w:r>
     </w:p>
     <w:p>
@@ -7050,58 +6990,15 @@
         <w:ind w:left="763" w:right="0" w:firstLine="0"/>
         <w:jc w:val="left"/>
         <w:rPr>
-          <w:rFonts w:ascii="Times New Roman" w:cs="Times New Roman" w:eastAsia="Times New Roman" w:hAnsi="Times New Roman"/>
-          <w:b w:val="0"/>
-          <w:bCs w:val="0"/>
           <w:i w:val="1"/>
           <w:iCs w:val="1"/>
-          <w:smallCaps w:val="0"/>
-          <w:strike w:val="0"/>
           <w:color w:val="0000ff"/>
-          <w:sz w:val="20"/>
-          <w:szCs w:val="20"/>
-          <w:u w:val="none"/>
-          <w:shd w:fill="auto" w:val="clear"/>
-          <w:vertAlign w:val="baseline"/>
         </w:rPr>
       </w:pPr>
       <w:r>
         <w:rPr>
-          <w:rFonts w:ascii="Times New Roman" w:cs="Times New Roman" w:eastAsia="Times New Roman" w:hAnsi="Times New Roman"/>
-          <w:b w:val="0"/>
-          <w:bCs w:val="0"/>
-          <w:i w:val="1"/>
-          <w:iCs w:val="1"/>
-          <w:smallCaps w:val="0"/>
-          <w:strike w:val="0"/>
-          <w:color w:val="0000ff"/>
-          <w:sz w:val="20"/>
-          <w:szCs w:val="20"/>
-          <w:u w:val="none"/>
-          <w:shd w:fill="auto" w:val="clear"/>
-          <w:vertAlign w:val="baseline"/>
-          <w:rtl w:val="0"/>
-        </w:rPr>
-        <w:t xml:space="preserve">Where application development tools, such as requirements tools, modeling tools, and the like, are employed to capture the functionality, this section of the document would refer to the availability of that data, indicating the location and name of the tool used to capture the data.]</w:t>
-      </w:r>
-    </w:p>
-    <w:p>
-      <w:pPr>
-        <w:pStyle w:val="Heading3"/>
-        <w:numPr>
-          <w:ilvl w:val="2"/>
-          <w:numId w:val="1"/>
-        </w:numPr>
-        <w:ind w:left="0" w:firstLine="0"/>
-        <w:rPr/>
-      </w:pPr>
-      <w:bookmarkStart w:colFirst="0" w:colLast="0" w:name="_heading=h.kfn6mv5ssp09" w:id="23"/>
-      <w:bookmarkEnd w:id="23"/>
-      <w:r>
-        <w:rPr>
-          <w:rtl w:val="0"/>
-        </w:rPr>
-        <w:t xml:space="preserve">&lt;Functional Requirement One&gt;</w:t>
+          <w:rtl w:val="0"/>
+        </w:rPr>
       </w:r>
     </w:p>
     <w:p>
@@ -7154,26 +7051,45 @@
           <w:vertAlign w:val="baseline"/>
           <w:rtl w:val="0"/>
         </w:rPr>
-        <w:t xml:space="preserve">[The requirement description.]</w:t>
-      </w:r>
-    </w:p>
-    <w:p>
-      <w:pPr>
-        <w:pStyle w:val="Heading2"/>
-        <w:numPr>
-          <w:ilvl w:val="1"/>
-          <w:numId w:val="1"/>
-        </w:numPr>
-        <w:ind w:left="0" w:firstLine="0"/>
-        <w:rPr/>
-      </w:pPr>
-      <w:bookmarkStart w:colFirst="0" w:colLast="0" w:name="_heading=h.kenqh4c2r99t" w:id="24"/>
-      <w:bookmarkEnd w:id="24"/>
-      <w:r>
-        <w:rPr>
-          <w:rtl w:val="0"/>
-        </w:rPr>
-        <w:t xml:space="preserve">Use-Case Specifications</w:t>
+        <w:t xml:space="preserve">[This section describes the functional requirements of the system for those requirements that are expressed in the natural language style. For many applications, this may constitute the bulk of the </w:t>
+      </w:r>
+      <w:r>
+        <w:rPr>
+          <w:rFonts w:ascii="Times New Roman" w:cs="Times New Roman" w:eastAsia="Times New Roman" w:hAnsi="Times New Roman"/>
+          <w:b w:val="1"/>
+          <w:bCs w:val="1"/>
+          <w:i w:val="1"/>
+          <w:iCs w:val="1"/>
+          <w:smallCaps w:val="0"/>
+          <w:strike w:val="0"/>
+          <w:color w:val="0000ff"/>
+          <w:sz w:val="20"/>
+          <w:szCs w:val="20"/>
+          <w:u w:val="none"/>
+          <w:shd w:fill="auto" w:val="clear"/>
+          <w:vertAlign w:val="baseline"/>
+          <w:rtl w:val="0"/>
+        </w:rPr>
+        <w:t xml:space="preserve">SRS</w:t>
+      </w:r>
+      <w:r>
+        <w:rPr>
+          <w:rFonts w:ascii="Times New Roman" w:cs="Times New Roman" w:eastAsia="Times New Roman" w:hAnsi="Times New Roman"/>
+          <w:b w:val="0"/>
+          <w:bCs w:val="0"/>
+          <w:i w:val="1"/>
+          <w:iCs w:val="1"/>
+          <w:smallCaps w:val="0"/>
+          <w:strike w:val="0"/>
+          <w:color w:val="0000ff"/>
+          <w:sz w:val="20"/>
+          <w:szCs w:val="20"/>
+          <w:u w:val="none"/>
+          <w:shd w:fill="auto" w:val="clear"/>
+          <w:vertAlign w:val="baseline"/>
+          <w:rtl w:val="0"/>
+        </w:rPr>
+        <w:t xml:space="preserve"> package and thought should be given to the organization of this section. This section is typically organized by feature, but alternative organization methods may also be appropriate; for example, organization by user or organization by subsystem. Functional requirements may include feature sets, capabilities, and security.</w:t>
       </w:r>
     </w:p>
     <w:p>
@@ -7226,26 +7142,152 @@
           <w:vertAlign w:val="baseline"/>
           <w:rtl w:val="0"/>
         </w:rPr>
-        <w:t xml:space="preserve">[In use-case modeling, the use cases often define the majority of the functional requirements of the system, along with some non-functional requirements.]</w:t>
+        <w:t xml:space="preserve">Where application development tools, such as requirements tools, modeling tools, and the like, are employed to capture the functionality, this section of the document would refer to the availability of that data, indicating the location and name of the tool used to capture the data.]</w:t>
       </w:r>
     </w:p>
     <w:p>
       <w:pPr>
-        <w:pStyle w:val="Heading2"/>
+        <w:pStyle w:val="Heading3"/>
         <w:numPr>
-          <w:ilvl w:val="1"/>
+          <w:ilvl w:val="2"/>
           <w:numId w:val="1"/>
         </w:numPr>
         <w:ind w:left="0" w:firstLine="0"/>
         <w:rPr/>
       </w:pPr>
-      <w:bookmarkStart w:colFirst="0" w:colLast="0" w:name="_heading=h.xsg02ecrvnqu" w:id="25"/>
+      <w:bookmarkStart w:colFirst="0" w:colLast="0" w:name="_heading=h.kfn6mv5ssp09" w:id="23"/>
+      <w:bookmarkEnd w:id="23"/>
+      <w:r>
+        <w:rPr>
+          <w:rtl w:val="0"/>
+        </w:rPr>
+        <w:t xml:space="preserve">User Interface</w:t>
+      </w:r>
+    </w:p>
+    <w:p>
+      <w:pPr>
+        <w:spacing w:after="120" w:before="120" w:lineRule="auto"/>
+        <w:ind w:left="763" w:firstLine="0"/>
+        <w:rPr/>
+      </w:pPr>
+      <w:r>
+        <w:rPr>
+          <w:rtl w:val="0"/>
+        </w:rPr>
+        <w:t xml:space="preserve">The system should not allow input of any unused characters. Every valid character input will also be displayed on screen in an interactive keyboard, along with backspace and clear, and a submenu will have a list of constants. The interface should display the current expression and the result after submission. There will also be a menu option to show a brief history of evaluated expressions. The error highlighting should be integrated into the display of the current expression. Expressions that are longer than the input window should automatically scroll the string to the left, keeping the input right-justified.</w:t>
+      </w:r>
+      <w:r>
+        <w:rPr>
+          <w:rtl w:val="0"/>
+        </w:rPr>
+      </w:r>
+    </w:p>
+    <w:p>
+      <w:pPr>
+        <w:pStyle w:val="Heading3"/>
+        <w:numPr>
+          <w:ilvl w:val="2"/>
+          <w:numId w:val="1"/>
+        </w:numPr>
+      </w:pPr>
+      <w:bookmarkStart w:colFirst="0" w:colLast="0" w:name="_heading=h.8bx3nz1daeaw" w:id="24"/>
+      <w:bookmarkEnd w:id="24"/>
+      <w:r>
+        <w:rPr>
+          <w:rtl w:val="0"/>
+        </w:rPr>
+        <w:t xml:space="preserve">Error Highlighting</w:t>
+      </w:r>
+    </w:p>
+    <w:p>
+      <w:pPr>
+        <w:spacing w:after="120" w:before="120" w:lineRule="auto"/>
+        <w:ind w:left="763" w:firstLine="0"/>
+        <w:rPr/>
+      </w:pPr>
+      <w:r>
+        <w:rPr>
+          <w:rtl w:val="0"/>
+        </w:rPr>
+        <w:t xml:space="preserve">This function will be integrated into the whole computation process using throwing and catching capabilities to identify errors and their causes. The highlighting will be integrated into the interface to show which character caused the error. Then remove the unexpected tokens, add expected tokens, and continue to evaluate until a fatal error is found or a result can be reached.</w:t>
+      </w:r>
+    </w:p>
+    <w:p>
+      <w:pPr>
+        <w:pStyle w:val="Heading3"/>
+        <w:numPr>
+          <w:ilvl w:val="2"/>
+          <w:numId w:val="1"/>
+        </w:numPr>
+      </w:pPr>
+      <w:bookmarkStart w:colFirst="0" w:colLast="0" w:name="_heading=h.uimhhqth6ym1" w:id="25"/>
       <w:bookmarkEnd w:id="25"/>
       <w:r>
         <w:rPr>
           <w:rtl w:val="0"/>
         </w:rPr>
-        <w:t xml:space="preserve">Supplementary Requirements </w:t>
+        <w:t xml:space="preserve">Tokenization</w:t>
+      </w:r>
+    </w:p>
+    <w:p>
+      <w:pPr>
+        <w:spacing w:after="120" w:before="120" w:lineRule="auto"/>
+        <w:ind w:left="763" w:firstLine="0"/>
+        <w:rPr/>
+      </w:pPr>
+      <w:r>
+        <w:rPr>
+          <w:rtl w:val="0"/>
+        </w:rPr>
+        <w:t xml:space="preserve">This module will capture valid input strings and differentiate between unary and binary operators with the same symbol. It will throw errors with a description the Error Highlighting module can use. </w:t>
+      </w:r>
+    </w:p>
+    <w:p>
+      <w:pPr>
+        <w:pStyle w:val="Heading3"/>
+        <w:numPr>
+          <w:ilvl w:val="2"/>
+          <w:numId w:val="1"/>
+        </w:numPr>
+      </w:pPr>
+      <w:bookmarkStart w:colFirst="0" w:colLast="0" w:name="_heading=h.dosex6ew3zq3" w:id="26"/>
+      <w:bookmarkEnd w:id="26"/>
+      <w:r>
+        <w:rPr>
+          <w:rtl w:val="0"/>
+        </w:rPr>
+        <w:t xml:space="preserve">Prioritization</w:t>
+      </w:r>
+    </w:p>
+    <w:p>
+      <w:pPr>
+        <w:spacing w:after="120" w:before="120" w:lineRule="auto"/>
+        <w:ind w:left="763" w:firstLine="0"/>
+        <w:rPr/>
+      </w:pPr>
+      <w:r>
+        <w:rPr>
+          <w:rtl w:val="0"/>
+        </w:rPr>
+        <w:t xml:space="preserve">When evaluating prioritization, an error should be thrown with mismatched parentheses along with a description that the Error Highlighting module can use to assume a valid prioritization.</w:t>
+      </w:r>
+    </w:p>
+    <w:p>
+      <w:pPr>
+        <w:pStyle w:val="Heading3"/>
+        <w:numPr>
+          <w:ilvl w:val="2"/>
+          <w:numId w:val="1"/>
+        </w:numPr>
+        <w:rPr/>
+      </w:pPr>
+      <w:bookmarkStart w:colFirst="0" w:colLast="0" w:name="_heading=h.1gzz5kmdhdf9" w:id="27"/>
+      <w:bookmarkEnd w:id="27"/>
+      <w:r>
+        <w:rPr>
+          <w:rtl w:val="0"/>
+        </w:rPr>
+        <w:t xml:space="preserve">Evaluation</w:t>
       </w:r>
     </w:p>
     <w:p>
@@ -7265,6 +7307,128 @@
         <w:spacing w:after="120" w:before="120" w:line="240" w:lineRule="auto"/>
         <w:ind w:left="763" w:right="0" w:firstLine="0"/>
         <w:jc w:val="left"/>
+        <w:rPr/>
+      </w:pPr>
+      <w:r>
+        <w:rPr>
+          <w:rtl w:val="0"/>
+        </w:rPr>
+        <w:t xml:space="preserve">The program needs to accurately compute arithmetic operations.</w:t>
+      </w:r>
+      <w:r>
+        <w:rPr>
+          <w:rtl w:val="0"/>
+        </w:rPr>
+      </w:r>
+    </w:p>
+    <w:p>
+      <w:pPr>
+        <w:pStyle w:val="Heading2"/>
+        <w:numPr>
+          <w:ilvl w:val="1"/>
+          <w:numId w:val="1"/>
+        </w:numPr>
+        <w:ind w:left="0" w:firstLine="0"/>
+        <w:rPr/>
+      </w:pPr>
+      <w:bookmarkStart w:colFirst="0" w:colLast="0" w:name="_heading=h.kenqh4c2r99t" w:id="28"/>
+      <w:bookmarkEnd w:id="28"/>
+      <w:r>
+        <w:rPr>
+          <w:rtl w:val="0"/>
+        </w:rPr>
+        <w:t xml:space="preserve">Use-Case Specifications</w:t>
+      </w:r>
+    </w:p>
+    <w:p>
+      <w:pPr>
+        <w:keepNext w:val="0"/>
+        <w:keepLines w:val="0"/>
+        <w:pageBreakBefore w:val="0"/>
+        <w:widowControl w:val="0"/>
+        <w:pBdr>
+          <w:top w:space="0" w:sz="0" w:val="nil"/>
+          <w:left w:space="0" w:sz="0" w:val="nil"/>
+          <w:bottom w:space="0" w:sz="0" w:val="nil"/>
+          <w:right w:space="0" w:sz="0" w:val="nil"/>
+          <w:between w:space="0" w:sz="0" w:val="nil"/>
+        </w:pBdr>
+        <w:shd w:fill="auto" w:val="clear"/>
+        <w:spacing w:after="120" w:before="120" w:line="240" w:lineRule="auto"/>
+        <w:ind w:left="763" w:right="0" w:firstLine="0"/>
+        <w:jc w:val="left"/>
+        <w:rPr>
+          <w:rFonts w:ascii="Times New Roman" w:cs="Times New Roman" w:eastAsia="Times New Roman" w:hAnsi="Times New Roman"/>
+          <w:b w:val="0"/>
+          <w:bCs w:val="0"/>
+          <w:i w:val="1"/>
+          <w:iCs w:val="1"/>
+          <w:smallCaps w:val="0"/>
+          <w:strike w:val="0"/>
+          <w:color w:val="0000ff"/>
+          <w:sz w:val="20"/>
+          <w:szCs w:val="20"/>
+          <w:u w:val="none"/>
+          <w:shd w:fill="auto" w:val="clear"/>
+          <w:vertAlign w:val="baseline"/>
+        </w:rPr>
+      </w:pPr>
+      <w:r>
+        <w:rPr>
+          <w:rFonts w:ascii="Times New Roman" w:cs="Times New Roman" w:eastAsia="Times New Roman" w:hAnsi="Times New Roman"/>
+          <w:b w:val="0"/>
+          <w:bCs w:val="0"/>
+          <w:i w:val="1"/>
+          <w:iCs w:val="1"/>
+          <w:smallCaps w:val="0"/>
+          <w:strike w:val="0"/>
+          <w:color w:val="0000ff"/>
+          <w:sz w:val="20"/>
+          <w:szCs w:val="20"/>
+          <w:u w:val="none"/>
+          <w:shd w:fill="auto" w:val="clear"/>
+          <w:vertAlign w:val="baseline"/>
+          <w:rtl w:val="0"/>
+        </w:rPr>
+        <w:t xml:space="preserve">[In use-case modeling, the use cases often define the majority of the functional requirements of the system, along with some non-functional requirements.]</w:t>
+      </w:r>
+    </w:p>
+    <w:p>
+      <w:pPr>
+        <w:pStyle w:val="Heading2"/>
+        <w:numPr>
+          <w:ilvl w:val="1"/>
+          <w:numId w:val="1"/>
+        </w:numPr>
+        <w:ind w:left="0" w:firstLine="0"/>
+        <w:rPr/>
+      </w:pPr>
+      <w:bookmarkStart w:colFirst="0" w:colLast="0" w:name="_heading=h.xsg02ecrvnqu" w:id="29"/>
+      <w:bookmarkEnd w:id="29"/>
+      <w:r>
+        <w:rPr>
+          <w:rtl w:val="0"/>
+        </w:rPr>
+        <w:t xml:space="preserve">Supplementary Requirements </w:t>
+      </w:r>
+    </w:p>
+    <w:p>
+      <w:pPr>
+        <w:keepNext w:val="0"/>
+        <w:keepLines w:val="0"/>
+        <w:pageBreakBefore w:val="0"/>
+        <w:widowControl w:val="0"/>
+        <w:pBdr>
+          <w:top w:space="0" w:sz="0" w:val="nil"/>
+          <w:left w:space="0" w:sz="0" w:val="nil"/>
+          <w:bottom w:space="0" w:sz="0" w:val="nil"/>
+          <w:right w:space="0" w:sz="0" w:val="nil"/>
+          <w:between w:space="0" w:sz="0" w:val="nil"/>
+        </w:pBdr>
+        <w:shd w:fill="auto" w:val="clear"/>
+        <w:spacing w:after="120" w:before="120" w:line="240" w:lineRule="auto"/>
+        <w:ind w:left="763" w:right="0" w:firstLine="0"/>
+        <w:jc w:val="left"/>
         <w:rPr>
           <w:rFonts w:ascii="Times New Roman" w:cs="Times New Roman" w:eastAsia="Times New Roman" w:hAnsi="Times New Roman"/>
           <w:b w:val="0"/>
@@ -7350,8 +7514,8 @@
         <w:ind w:left="0" w:firstLine="0"/>
         <w:rPr/>
       </w:pPr>
-      <w:bookmarkStart w:colFirst="0" w:colLast="0" w:name="_heading=h.aksn34jf1zx6" w:id="26"/>
-      <w:bookmarkEnd w:id="26"/>
+      <w:bookmarkStart w:colFirst="0" w:colLast="0" w:name="_heading=h.aksn34jf1zx6" w:id="30"/>
+      <w:bookmarkEnd w:id="30"/>
       <w:r>
         <w:rPr>
           <w:rtl w:val="0"/>
@@ -7819,8 +7983,8 @@
         <w:ind w:left="0" w:firstLine="0"/>
         <w:rPr/>
       </w:pPr>
-      <w:bookmarkStart w:colFirst="0" w:colLast="0" w:name="_heading=h.fv3ngwtnasqq" w:id="27"/>
-      <w:bookmarkEnd w:id="27"/>
+      <w:bookmarkStart w:colFirst="0" w:colLast="0" w:name="_heading=h.fv3ngwtnasqq" w:id="31"/>
+      <w:bookmarkEnd w:id="31"/>
       <w:r>
         <w:rPr>
           <w:rtl w:val="0"/>
@@ -8559,7 +8723,7 @@
             </w:rPr>
             <w:t xml:space="preserve">  Version:</w:t>
             <w:tab/>
-            <w:t xml:space="preserve">1.1</w:t>
+            <w:t xml:space="preserve">1.2</w:t>
           </w:r>
         </w:p>
       </w:tc>
@@ -8604,7 +8768,7 @@
             </w:rPr>
             <w:t xml:space="preserve">  Date:</w:t>
             <w:tab/>
-            <w:t xml:space="preserve">2026-02-17</w:t>
+            <w:t xml:space="preserve">2026-02-24</w:t>
           </w:r>
         </w:p>
       </w:tc>
@@ -8937,6 +9101,20 @@
       <w:sz w:val="36"/>
       <w:szCs w:val="36"/>
     </w:rPr>
+  </w:style>
+  <w:style w:type="table" w:styleId="TableNormal" w:default="1">
+    <w:name w:val="TableNormal"/>
+    <w:tblPr>
+      <w:tblCellMar>
+        <w:top w:w="100.0" w:type="dxa"/>
+        <w:left w:w="100.0" w:type="dxa"/>
+        <w:bottom w:w="100.0" w:type="dxa"/>
+        <w:right w:w="100.0" w:type="dxa"/>
+      </w:tblCellMar>
+    </w:tblPr>
+  </w:style>
+  <w:style w:type="paragraph" w:styleId="Normal" w:default="1">
+    <w:name w:val="normal"/>
   </w:style>
   <w:style w:type="table" w:styleId="TableNormal" w:default="1">
     <w:name w:val="TableNormal"/>
@@ -9415,6 +9593,58 @@
       </w:tblCellMar>
     </w:tblPr>
   </w:style>
+  <w:style w:type="table" w:styleId="Table1">
+    <w:basedOn w:val="TableNormal"/>
+    <w:tblPr>
+      <w:tblStyleRowBandSize w:val="1"/>
+      <w:tblStyleColBandSize w:val="1"/>
+      <w:tblCellMar>
+        <w:top w:w="0.0" w:type="dxa"/>
+        <w:left w:w="115.0" w:type="dxa"/>
+        <w:bottom w:w="0.0" w:type="dxa"/>
+        <w:right w:w="115.0" w:type="dxa"/>
+      </w:tblCellMar>
+    </w:tblPr>
+  </w:style>
+  <w:style w:type="table" w:styleId="Table2">
+    <w:basedOn w:val="TableNormal"/>
+    <w:tblPr>
+      <w:tblStyleRowBandSize w:val="1"/>
+      <w:tblStyleColBandSize w:val="1"/>
+      <w:tblCellMar>
+        <w:top w:w="0.0" w:type="dxa"/>
+        <w:left w:w="70.0" w:type="dxa"/>
+        <w:bottom w:w="0.0" w:type="dxa"/>
+        <w:right w:w="70.0" w:type="dxa"/>
+      </w:tblCellMar>
+    </w:tblPr>
+  </w:style>
+  <w:style w:type="table" w:styleId="Table3">
+    <w:basedOn w:val="TableNormal"/>
+    <w:tblPr>
+      <w:tblStyleRowBandSize w:val="1"/>
+      <w:tblStyleColBandSize w:val="1"/>
+      <w:tblCellMar>
+        <w:top w:w="0.0" w:type="dxa"/>
+        <w:left w:w="115.0" w:type="dxa"/>
+        <w:bottom w:w="0.0" w:type="dxa"/>
+        <w:right w:w="115.0" w:type="dxa"/>
+      </w:tblCellMar>
+    </w:tblPr>
+  </w:style>
+  <w:style w:type="table" w:styleId="Table4">
+    <w:basedOn w:val="TableNormal"/>
+    <w:tblPr>
+      <w:tblStyleRowBandSize w:val="1"/>
+      <w:tblStyleColBandSize w:val="1"/>
+      <w:tblCellMar>
+        <w:top w:w="0.0" w:type="dxa"/>
+        <w:left w:w="115.0" w:type="dxa"/>
+        <w:bottom w:w="0.0" w:type="dxa"/>
+        <w:right w:w="115.0" w:type="dxa"/>
+      </w:tblCellMar>
+    </w:tblPr>
+  </w:style>
   <w:style w:type="paragraph" w:styleId="Subtitle">
     <w:name w:val="Subtitle"/>
     <w:basedOn w:val="Normal"/>
@@ -9783,7 +10013,7 @@
 
 <file path=customXML/item1.xml><?xml version="1.0" encoding="utf-8"?>
 <go:gDocsCustomXmlDataStorage xmlns:go="http://customooxmlschemas.google.com/" xmlns:r="http://schemas.openxmlformats.org/officeDocument/2006/relationships" uri="GoogleDocsCustomDataVersion2">
-  <go:docsCustomData xmlns:go="http://customooxmlschemas.google.com/" roundtripDataSignature="AMtx7mjoqIWBMrq03Qd5BbCy4HxSqr6zOg==">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</go:docsCustomData>
+  <go:docsCustomData xmlns:go="http://customooxmlschemas.google.com/" roundtripDataSignature="AMtx7mgfmgWldlaL8MBOGQ4ijpKNpzlA/A==">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</go:docsCustomData>
 </go:gDocsCustomXmlDataStorage>
 </file>
 

</xml_diff>

<commit_message>
Final draft of Software Requirements Specifications
</commit_message>
<xml_diff>
--- a/doc/Calculatorz_Software_Requirements_Specifications.docx
+++ b/doc/Calculatorz_Software_Requirements_Specifications.docx
@@ -1568,7 +1568,7 @@
     </w:p>
     <w:sdt>
       <w:sdtPr>
-        <w:id w:val="-409432783"/>
+        <w:id w:val="149291503"/>
         <w:docPartObj>
           <w:docPartGallery w:val="Table of Contents"/>
           <w:docPartUnique w:val="1"/>
@@ -3345,11 +3345,6 @@
         </w:rPr>
         <w:t xml:space="preserve">Introduction</w:t>
       </w:r>
-      <w:r>
-        <w:rPr>
-          <w:rtl w:val="0"/>
-        </w:rPr>
-      </w:r>
     </w:p>
     <w:p>
       <w:pPr>
@@ -3407,7 +3402,7 @@
         <w:rPr>
           <w:rtl w:val="0"/>
         </w:rPr>
-        <w:t xml:space="preserve">Our program will allow users to do basic calculator functions, such as all arithmetic operations. Utilizing valid inputs according to the standard order of operations and taking grouping symbols into account to alter precedence, and flagging invalid inputs to aid correction by the user.</w:t>
+        <w:t xml:space="preserve">Our program will allow users to do basic calculator functions, such as all arithmetic operations. Utilizing valid inputs according to the standard order of operations, taking grouping symbols into account to alter precedence, and flagging invalid inputs to aid correction by the user.</w:t>
       </w:r>
       <w:r>
         <w:rPr>
@@ -3471,7 +3466,7 @@
         <w:rPr>
           <w:rtl w:val="0"/>
         </w:rPr>
-        <w:t xml:space="preserve">The software will have a basic user interface for inputs and an error highlighter watching the whole program for thrown errors. Underneath will be a tokenizer module, a Prioritizer module, then an evaluator module; these will carryout the primary function of our program.</w:t>
+        <w:t xml:space="preserve">The software will have a basic user interface for inputs and an error highlighter watching the whole program for thrown errors. Underneath will be a tokenizer module, a Prioritizer module, then an evaluator module; these will carry out the primary function of our program.</w:t>
       </w:r>
       <w:r>
         <w:rPr>
@@ -3719,6 +3714,8 @@
           <w:ilvl w:val="0"/>
           <w:numId w:val="1"/>
         </w:numPr>
+        <w:ind w:left="0" w:firstLine="0"/>
+        <w:rPr/>
       </w:pPr>
       <w:bookmarkStart w:colFirst="0" w:colLast="0" w:name="_heading=h.lzoifrszw3ku" w:id="7"/>
       <w:bookmarkEnd w:id="7"/>
@@ -3727,11 +3724,6 @@
           <w:rtl w:val="0"/>
         </w:rPr>
         <w:t xml:space="preserve">Overall Description</w:t>
-      </w:r>
-      <w:r>
-        <w:rPr>
-          <w:rtl w:val="0"/>
-        </w:rPr>
       </w:r>
     </w:p>
     <w:p>
@@ -3752,11 +3744,6 @@
         </w:rPr>
         <w:t xml:space="preserve">Product perspective</w:t>
       </w:r>
-      <w:r>
-        <w:rPr>
-          <w:rtl w:val="0"/>
-        </w:rPr>
-      </w:r>
     </w:p>
     <w:p>
       <w:pPr>
@@ -3789,7 +3776,7 @@
         <w:rPr>
           <w:rtl w:val="0"/>
         </w:rPr>
-        <w:t xml:space="preserve">We plan on using Qt for the front-end design. This will enable us to create a product that is user-friendly and intuitive to use, and can facilitate our detailed input error highlighting.</w:t>
+        <w:t xml:space="preserve">We plan on using Qt for the front-end design. This will enable us to create a product that is user-friendly and intuitive to use, and it can facilitate our detailed input error highlighting.</w:t>
       </w:r>
       <w:r>
         <w:rPr>
@@ -3984,7 +3971,7 @@
         <w:rPr>
           <w:rtl w:val="0"/>
         </w:rPr>
-        <w:t xml:space="preserve">The user interface will allow us to limit the possible inputs and the error highlighting can be used to deal with invalid inputs without crashing. Dispite using the </w:t>
+        <w:t xml:space="preserve">The user interface will allow us to limit the possible inputs and the error highlighting can be used to deal with invalid inputs without crashing. Despite using the </w:t>
       </w:r>
       <w:r>
         <w:rPr>
@@ -4055,6 +4042,7 @@
           <w:ilvl w:val="0"/>
           <w:numId w:val="1"/>
         </w:numPr>
+        <w:ind w:left="0" w:firstLine="0"/>
         <w:rPr>
           <w:rFonts w:ascii="Arial" w:cs="Arial" w:eastAsia="Arial" w:hAnsi="Arial"/>
           <w:b w:val="1"/>
@@ -4383,11 +4371,6 @@
         </w:rPr>
         <w:t xml:space="preserve">Supplementary Requirements</w:t>
       </w:r>
-      <w:r>
-        <w:rPr>
-          <w:rtl w:val="0"/>
-        </w:rPr>
-      </w:r>
     </w:p>
     <w:p>
       <w:pPr>
@@ -4396,6 +4379,7 @@
           <w:ilvl w:val="2"/>
           <w:numId w:val="1"/>
         </w:numPr>
+        <w:ind w:left="0" w:firstLine="0"/>
         <w:rPr>
           <w:b w:val="0"/>
           <w:bCs w:val="0"/>
@@ -4410,6 +4394,11 @@
           <w:rtl w:val="0"/>
         </w:rPr>
         <w:t xml:space="preserve">Locally Executed</w:t>
+      </w:r>
+      <w:r>
+        <w:rPr>
+          <w:rtl w:val="0"/>
+        </w:rPr>
       </w:r>
     </w:p>
     <w:p>
@@ -4441,6 +4430,8 @@
           <w:ilvl w:val="2"/>
           <w:numId w:val="1"/>
         </w:numPr>
+        <w:ind w:left="0" w:firstLine="0"/>
+        <w:rPr/>
       </w:pPr>
       <w:bookmarkStart w:colFirst="0" w:colLast="0" w:name="_heading=h.q2fuz6njwlqb" w:id="26"/>
       <w:bookmarkEnd w:id="26"/>
@@ -4480,6 +4471,8 @@
           <w:ilvl w:val="2"/>
           <w:numId w:val="1"/>
         </w:numPr>
+        <w:ind w:left="0" w:firstLine="0"/>
+        <w:rPr/>
       </w:pPr>
       <w:bookmarkStart w:colFirst="0" w:colLast="0" w:name="_heading=h.uq7fdgnf3rew" w:id="27"/>
       <w:bookmarkEnd w:id="27"/>
@@ -4488,11 +4481,6 @@
           <w:rtl w:val="0"/>
         </w:rPr>
         <w:t xml:space="preserve">Self-Contained</w:t>
-      </w:r>
-      <w:r>
-        <w:rPr>
-          <w:rtl w:val="0"/>
-        </w:rPr>
       </w:r>
     </w:p>
     <w:p>
@@ -4509,7 +4497,7 @@
         <w:rPr>
           <w:rtl w:val="0"/>
         </w:rPr>
-        <w:t xml:space="preserve">Will not create supplementary files in the same directory as the executable, and will uninstall seamlessly.</w:t>
+        <w:t xml:space="preserve">Will not create supplementary files in the same directory as the executable and will uninstall seamlessly.</w:t>
       </w:r>
       <w:r>
         <w:rPr>
@@ -4524,6 +4512,8 @@
           <w:ilvl w:val="2"/>
           <w:numId w:val="1"/>
         </w:numPr>
+        <w:ind w:left="0" w:firstLine="0"/>
+        <w:rPr/>
       </w:pPr>
       <w:bookmarkStart w:colFirst="0" w:colLast="0" w:name="_heading=h.vz1ub78rq8v3" w:id="28"/>
       <w:bookmarkEnd w:id="28"/>
@@ -4532,11 +4522,6 @@
           <w:rtl w:val="0"/>
         </w:rPr>
         <w:t xml:space="preserve">Multi-Platform</w:t>
-      </w:r>
-      <w:r>
-        <w:rPr>
-          <w:rtl w:val="0"/>
-        </w:rPr>
       </w:r>
     </w:p>
     <w:p>
@@ -4567,6 +4552,7 @@
           <w:ilvl w:val="0"/>
           <w:numId w:val="1"/>
         </w:numPr>
+        <w:ind w:left="0" w:firstLine="0"/>
         <w:rPr>
           <w:rFonts w:ascii="Arial" w:cs="Arial" w:eastAsia="Arial" w:hAnsi="Arial"/>
           <w:b w:val="1"/>
@@ -5250,7 +5236,7 @@
               <w:rPr>
                 <w:rtl w:val="0"/>
               </w:rPr>
-              <w:t xml:space="preserve">Efficent</w:t>
+              <w:t xml:space="preserve">Efficient</w:t>
             </w:r>
           </w:p>
         </w:tc>
@@ -6597,6 +6583,20 @@
   <w:style w:type="paragraph" w:styleId="Normal" w:default="1">
     <w:name w:val="normal"/>
   </w:style>
+  <w:style w:type="table" w:styleId="TableNormal" w:default="1">
+    <w:name w:val="TableNormal"/>
+    <w:tblPr>
+      <w:tblCellMar>
+        <w:top w:w="100.0" w:type="dxa"/>
+        <w:left w:w="100.0" w:type="dxa"/>
+        <w:bottom w:w="100.0" w:type="dxa"/>
+        <w:right w:w="100.0" w:type="dxa"/>
+      </w:tblCellMar>
+    </w:tblPr>
+  </w:style>
+  <w:style w:type="paragraph" w:styleId="Normal" w:default="1">
+    <w:name w:val="normal"/>
+  </w:style>
   <w:style w:type="paragraph" w:styleId="Heading7">
     <w:name w:val="heading 7"/>
     <w:basedOn w:val="Normal"/>
@@ -7007,6 +7007,58 @@
       <w:b w:val="1"/>
       <w:bCs w:val="1"/>
     </w:rPr>
+  </w:style>
+  <w:style w:type="table" w:styleId="Table1">
+    <w:basedOn w:val="TableNormal"/>
+    <w:tblPr>
+      <w:tblStyleRowBandSize w:val="1"/>
+      <w:tblStyleColBandSize w:val="1"/>
+      <w:tblCellMar>
+        <w:top w:w="0.0" w:type="dxa"/>
+        <w:left w:w="115.0" w:type="dxa"/>
+        <w:bottom w:w="0.0" w:type="dxa"/>
+        <w:right w:w="115.0" w:type="dxa"/>
+      </w:tblCellMar>
+    </w:tblPr>
+  </w:style>
+  <w:style w:type="table" w:styleId="Table2">
+    <w:basedOn w:val="TableNormal"/>
+    <w:tblPr>
+      <w:tblStyleRowBandSize w:val="1"/>
+      <w:tblStyleColBandSize w:val="1"/>
+      <w:tblCellMar>
+        <w:top w:w="0.0" w:type="dxa"/>
+        <w:left w:w="70.0" w:type="dxa"/>
+        <w:bottom w:w="0.0" w:type="dxa"/>
+        <w:right w:w="70.0" w:type="dxa"/>
+      </w:tblCellMar>
+    </w:tblPr>
+  </w:style>
+  <w:style w:type="table" w:styleId="Table3">
+    <w:basedOn w:val="TableNormal"/>
+    <w:tblPr>
+      <w:tblStyleRowBandSize w:val="1"/>
+      <w:tblStyleColBandSize w:val="1"/>
+      <w:tblCellMar>
+        <w:top w:w="0.0" w:type="dxa"/>
+        <w:left w:w="115.0" w:type="dxa"/>
+        <w:bottom w:w="0.0" w:type="dxa"/>
+        <w:right w:w="115.0" w:type="dxa"/>
+      </w:tblCellMar>
+    </w:tblPr>
+  </w:style>
+  <w:style w:type="table" w:styleId="Table4">
+    <w:basedOn w:val="TableNormal"/>
+    <w:tblPr>
+      <w:tblStyleRowBandSize w:val="1"/>
+      <w:tblStyleColBandSize w:val="1"/>
+      <w:tblCellMar>
+        <w:top w:w="0.0" w:type="dxa"/>
+        <w:left w:w="115.0" w:type="dxa"/>
+        <w:bottom w:w="0.0" w:type="dxa"/>
+        <w:right w:w="115.0" w:type="dxa"/>
+      </w:tblCellMar>
+    </w:tblPr>
   </w:style>
   <w:style w:type="table" w:styleId="Table1">
     <w:basedOn w:val="TableNormal"/>
@@ -7532,7 +7584,7 @@
 
 <file path=customXML/item1.xml><?xml version="1.0" encoding="utf-8"?>
 <go:gDocsCustomXmlDataStorage xmlns:go="http://customooxmlschemas.google.com/" xmlns:r="http://schemas.openxmlformats.org/officeDocument/2006/relationships" uri="GoogleDocsCustomDataVersion2">
-  <go:docsCustomData xmlns:go="http://customooxmlschemas.google.com/" roundtripDataSignature="AMtx7mg0pf027/jDr3rGlPA9o2AyV4h6Wg==">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</go:docsCustomData>
+  <go:docsCustomData xmlns:go="http://customooxmlschemas.google.com/" roundtripDataSignature="AMtx7mh3KxArhrpMGiXEMr2VHJg/mJ1okw==">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</go:docsCustomData>
 </go:gDocsCustomXmlDataStorage>
 </file>
 

</xml_diff>

<commit_message>
Final draft of Software Requirements Specifications (for real this time)
</commit_message>
<xml_diff>
--- a/doc/Calculatorz_Software_Requirements_Specifications.docx
+++ b/doc/Calculatorz_Software_Requirements_Specifications.docx
@@ -95,7 +95,7 @@
           <w:szCs w:val="28"/>
           <w:rtl w:val="0"/>
         </w:rPr>
-        <w:t xml:space="preserve">Version 1.4</w:t>
+        <w:t xml:space="preserve">Version 1.5</w:t>
       </w:r>
       <w:r>
         <w:rPr>
@@ -1429,6 +1429,7 @@
               <w:rPr>
                 <w:rtl w:val="0"/>
               </w:rPr>
+              <w:t xml:space="preserve">2026-03-10</w:t>
             </w:r>
           </w:p>
         </w:tc>
@@ -1458,6 +1459,7 @@
               <w:rPr>
                 <w:rtl w:val="0"/>
               </w:rPr>
+              <w:t xml:space="preserve">1.5</w:t>
             </w:r>
           </w:p>
         </w:tc>
@@ -1487,6 +1489,7 @@
               <w:rPr>
                 <w:rtl w:val="0"/>
               </w:rPr>
+              <w:t xml:space="preserve">Final touches</w:t>
             </w:r>
           </w:p>
         </w:tc>
@@ -1516,6 +1519,130 @@
               <w:rPr>
                 <w:rtl w:val="0"/>
               </w:rPr>
+              <w:t xml:space="preserve">Isaiah + Group</w:t>
+            </w:r>
+          </w:p>
+        </w:tc>
+      </w:tr>
+      <w:tr>
+        <w:trPr>
+          <w:cantSplit w:val="0"/>
+          <w:trHeight w:val="321.0000000000001" w:hRule="atLeast"/>
+          <w:tblHeader w:val="0"/>
+        </w:trPr>
+        <w:tc>
+          <w:tcPr>
+            <w:vAlign w:val="center"/>
+          </w:tcPr>
+          <w:p>
+            <w:pPr>
+              <w:keepNext w:val="0"/>
+              <w:keepLines w:val="1"/>
+              <w:widowControl w:val="0"/>
+              <w:pBdr>
+                <w:top w:space="0" w:sz="0" w:val="nil"/>
+                <w:left w:space="0" w:sz="0" w:val="nil"/>
+                <w:bottom w:space="0" w:sz="0" w:val="nil"/>
+                <w:right w:space="0" w:sz="0" w:val="nil"/>
+                <w:between w:space="0" w:sz="0" w:val="nil"/>
+              </w:pBdr>
+              <w:shd w:fill="auto" w:val="clear"/>
+              <w:spacing w:after="0" w:before="0" w:line="240" w:lineRule="auto"/>
+              <w:ind w:left="0" w:right="0" w:firstLine="0"/>
+              <w:jc w:val="left"/>
+              <w:rPr/>
+            </w:pPr>
+            <w:r>
+              <w:rPr>
+                <w:rtl w:val="0"/>
+              </w:rPr>
+            </w:r>
+          </w:p>
+        </w:tc>
+        <w:tc>
+          <w:tcPr>
+            <w:vAlign w:val="center"/>
+          </w:tcPr>
+          <w:p>
+            <w:pPr>
+              <w:keepNext w:val="0"/>
+              <w:keepLines w:val="1"/>
+              <w:widowControl w:val="0"/>
+              <w:pBdr>
+                <w:top w:space="0" w:sz="0" w:val="nil"/>
+                <w:left w:space="0" w:sz="0" w:val="nil"/>
+                <w:bottom w:space="0" w:sz="0" w:val="nil"/>
+                <w:right w:space="0" w:sz="0" w:val="nil"/>
+                <w:between w:space="0" w:sz="0" w:val="nil"/>
+              </w:pBdr>
+              <w:shd w:fill="auto" w:val="clear"/>
+              <w:spacing w:after="0" w:before="0" w:line="240" w:lineRule="auto"/>
+              <w:ind w:left="0" w:right="0" w:firstLine="0"/>
+              <w:jc w:val="left"/>
+              <w:rPr/>
+            </w:pPr>
+            <w:r>
+              <w:rPr>
+                <w:rtl w:val="0"/>
+              </w:rPr>
+            </w:r>
+          </w:p>
+        </w:tc>
+        <w:tc>
+          <w:tcPr>
+            <w:vAlign w:val="center"/>
+          </w:tcPr>
+          <w:p>
+            <w:pPr>
+              <w:keepNext w:val="0"/>
+              <w:keepLines w:val="1"/>
+              <w:widowControl w:val="0"/>
+              <w:pBdr>
+                <w:top w:space="0" w:sz="0" w:val="nil"/>
+                <w:left w:space="0" w:sz="0" w:val="nil"/>
+                <w:bottom w:space="0" w:sz="0" w:val="nil"/>
+                <w:right w:space="0" w:sz="0" w:val="nil"/>
+                <w:between w:space="0" w:sz="0" w:val="nil"/>
+              </w:pBdr>
+              <w:shd w:fill="auto" w:val="clear"/>
+              <w:spacing w:after="0" w:before="0" w:line="240" w:lineRule="auto"/>
+              <w:ind w:left="0" w:right="0" w:firstLine="0"/>
+              <w:jc w:val="left"/>
+              <w:rPr/>
+            </w:pPr>
+            <w:r>
+              <w:rPr>
+                <w:rtl w:val="0"/>
+              </w:rPr>
+            </w:r>
+          </w:p>
+        </w:tc>
+        <w:tc>
+          <w:tcPr>
+            <w:vAlign w:val="center"/>
+          </w:tcPr>
+          <w:p>
+            <w:pPr>
+              <w:keepNext w:val="0"/>
+              <w:keepLines w:val="1"/>
+              <w:widowControl w:val="0"/>
+              <w:pBdr>
+                <w:top w:space="0" w:sz="0" w:val="nil"/>
+                <w:left w:space="0" w:sz="0" w:val="nil"/>
+                <w:bottom w:space="0" w:sz="0" w:val="nil"/>
+                <w:right w:space="0" w:sz="0" w:val="nil"/>
+                <w:between w:space="0" w:sz="0" w:val="nil"/>
+              </w:pBdr>
+              <w:shd w:fill="auto" w:val="clear"/>
+              <w:spacing w:after="0" w:before="0" w:line="240" w:lineRule="auto"/>
+              <w:ind w:left="0" w:right="0" w:firstLine="0"/>
+              <w:jc w:val="left"/>
+              <w:rPr/>
+            </w:pPr>
+            <w:r>
+              <w:rPr>
+                <w:rtl w:val="0"/>
+              </w:rPr>
             </w:r>
           </w:p>
         </w:tc>
@@ -1568,7 +1695,7 @@
     </w:p>
     <w:sdt>
       <w:sdtPr>
-        <w:id w:val="1981427382"/>
+        <w:id w:val="-1700610409"/>
         <w:docPartObj>
           <w:docPartGallery w:val="Table of Contents"/>
           <w:docPartUnique w:val="1"/>
@@ -3815,7 +3942,7 @@
         <w:rPr>
           <w:rtl w:val="0"/>
         </w:rPr>
-        <w:t xml:space="preserve">One of the many benefits to Qt is that the interface can be locally generated and run, so we would not have to rely on an internet connection. We can also use Qt to compile executables for several different operating systems.</w:t>
+        <w:t xml:space="preserve">One of the many benefits of Qt is that the interface can be locally generated and run, so we would not have to rely on an internet connection. We can also use Qt to compile executables for several different operating systems.</w:t>
       </w:r>
       <w:r>
         <w:rPr>
@@ -3905,7 +4032,7 @@
         <w:rPr>
           <w:rtl w:val="0"/>
         </w:rPr>
-        <w:t xml:space="preserve">Generally, our software will perform all arithmetic. For our specific userbase, we will implement random number generators themed as dice, and a persistent history of calculations performed.</w:t>
+        <w:t xml:space="preserve">Generally, our software will perform all arithmetic. For our specific user base, we will implement random number generators themed as dice, and a persistent history of calculations performed.</w:t>
       </w:r>
     </w:p>
     <w:p>
@@ -3971,7 +4098,7 @@
         <w:rPr>
           <w:rtl w:val="0"/>
         </w:rPr>
-        <w:t xml:space="preserve">The user interface will allow us to limit the possible inputs and the error highlighting can be used to deal with invalid inputs without crashing. Despite using the </w:t>
+        <w:t xml:space="preserve">The user interface will allow us to limit the possible inputs, and the error highlighting can be used to deal with invalid inputs without crashing. Despite using the </w:t>
       </w:r>
       <w:r>
         <w:rPr>
@@ -4345,7 +4472,7 @@
         <w:rPr>
           <w:rtl w:val="0"/>
         </w:rPr>
-        <w:t xml:space="preserve">Our primary use case will be getting the results of computations used during tabletop roleplaying games. This includes dice rolling of standard tabletop roleplaying game dice (having 4, 8, 6, 10, 12, 20, and 100 sides). Alongside computing any kind of arithmetic the user may input.</w:t>
+        <w:t xml:space="preserve">Our primary use case will be getting the results of computations used during tabletop role-playing games. This includes dice rolling of standard tabletop roleplaying game dice (having 4, 6, 8, 10, 12, 20, and 100 sides). Alongside computing any kind of arithmetic the user may input.</w:t>
       </w:r>
       <w:r>
         <w:rPr>
@@ -6162,7 +6289,7 @@
             </w:rPr>
             <w:t xml:space="preserve">  Version:</w:t>
             <w:tab/>
-            <w:t xml:space="preserve">1.4</w:t>
+            <w:t xml:space="preserve">1.5</w:t>
           </w:r>
         </w:p>
       </w:tc>
@@ -6207,7 +6334,7 @@
             </w:rPr>
             <w:t xml:space="preserve">  Date:</w:t>
             <w:tab/>
-            <w:t xml:space="preserve">2026-03-09</w:t>
+            <w:t xml:space="preserve">2026-03-10</w:t>
           </w:r>
         </w:p>
       </w:tc>

</xml_diff>